<commit_message>
Date 22 questions done
</commit_message>
<xml_diff>
--- a/Received/five/5 English.docx
+++ b/Received/five/5 English.docx
@@ -1,6 +1,6 @@
 
 <file path=word/document.xml><?xml version="1.0" encoding="utf-8"?>
-<w:document xmlns:wpc="http://schemas.microsoft.com/office/word/2010/wordprocessingCanvas" xmlns:cx="http://schemas.microsoft.com/office/drawing/2014/chartex" xmlns:cx1="http://schemas.microsoft.com/office/drawing/2015/9/8/chartex" xmlns:mc="http://schemas.openxmlformats.org/markup-compatibility/2006" xmlns:o="urn:schemas-microsoft-com:office:office" xmlns:r="http://schemas.openxmlformats.org/officeDocument/2006/relationships" xmlns:m="http://schemas.openxmlformats.org/officeDocument/2006/math" xmlns:v="urn:schemas-microsoft-com:vml" xmlns:wp14="http://schemas.microsoft.com/office/word/2010/wordprocessingDrawing" xmlns:wp="http://schemas.openxmlformats.org/drawingml/2006/wordprocessingDrawing" xmlns:w10="urn:schemas-microsoft-com:office:word" xmlns:w="http://schemas.openxmlformats.org/wordprocessingml/2006/main" xmlns:w14="http://schemas.microsoft.com/office/word/2010/wordml" xmlns:w15="http://schemas.microsoft.com/office/word/2012/wordml" xmlns:w16se="http://schemas.microsoft.com/office/word/2015/wordml/symex" xmlns:wpg="http://schemas.microsoft.com/office/word/2010/wordprocessingGroup" xmlns:wpi="http://schemas.microsoft.com/office/word/2010/wordprocessingInk" xmlns:wne="http://schemas.microsoft.com/office/word/2006/wordml" xmlns:wps="http://schemas.microsoft.com/office/word/2010/wordprocessingShape" mc:Ignorable="w14 w15 w16se wp14">
+<w:document xmlns:wpc="http://schemas.microsoft.com/office/word/2010/wordprocessingCanvas" xmlns:cx="http://schemas.microsoft.com/office/drawing/2014/chartex" xmlns:cx1="http://schemas.microsoft.com/office/drawing/2015/9/8/chartex" xmlns:cx2="http://schemas.microsoft.com/office/drawing/2015/10/21/chartex" xmlns:cx3="http://schemas.microsoft.com/office/drawing/2016/5/9/chartex" xmlns:cx4="http://schemas.microsoft.com/office/drawing/2016/5/10/chartex" xmlns:cx5="http://schemas.microsoft.com/office/drawing/2016/5/11/chartex" xmlns:cx6="http://schemas.microsoft.com/office/drawing/2016/5/12/chartex" xmlns:cx7="http://schemas.microsoft.com/office/drawing/2016/5/13/chartex" xmlns:cx8="http://schemas.microsoft.com/office/drawing/2016/5/14/chartex" xmlns:mc="http://schemas.openxmlformats.org/markup-compatibility/2006" xmlns:aink="http://schemas.microsoft.com/office/drawing/2016/ink" xmlns:am3d="http://schemas.microsoft.com/office/drawing/2017/model3d" xmlns:o="urn:schemas-microsoft-com:office:office" xmlns:oel="http://schemas.microsoft.com/office/2019/extlst" xmlns:r="http://schemas.openxmlformats.org/officeDocument/2006/relationships" xmlns:m="http://schemas.openxmlformats.org/officeDocument/2006/math" xmlns:v="urn:schemas-microsoft-com:vml" xmlns:wp14="http://schemas.microsoft.com/office/word/2010/wordprocessingDrawing" xmlns:wp="http://schemas.openxmlformats.org/drawingml/2006/wordprocessingDrawing" xmlns:w10="urn:schemas-microsoft-com:office:word" xmlns:w="http://schemas.openxmlformats.org/wordprocessingml/2006/main" xmlns:w14="http://schemas.microsoft.com/office/word/2010/wordml" xmlns:w15="http://schemas.microsoft.com/office/word/2012/wordml" xmlns:w16cex="http://schemas.microsoft.com/office/word/2018/wordml/cex" xmlns:w16cid="http://schemas.microsoft.com/office/word/2016/wordml/cid" xmlns:w16="http://schemas.microsoft.com/office/word/2018/wordml" xmlns:w16du="http://schemas.microsoft.com/office/word/2023/wordml/word16du" xmlns:w16sdtdh="http://schemas.microsoft.com/office/word/2020/wordml/sdtdatahash" xmlns:w16sdtfl="http://schemas.microsoft.com/office/word/2024/wordml/sdtformatlock" xmlns:w16se="http://schemas.microsoft.com/office/word/2015/wordml/symex" xmlns:wpg="http://schemas.microsoft.com/office/word/2010/wordprocessingGroup" xmlns:wpi="http://schemas.microsoft.com/office/word/2010/wordprocessingInk" xmlns:wne="http://schemas.microsoft.com/office/word/2006/wordml" xmlns:wps="http://schemas.microsoft.com/office/word/2010/wordprocessingShape" mc:Ignorable="w14 w15 w16se w16cid w16 w16cex w16sdtdh w16sdtfl w16du wp14">
   <w:body>
     <w:p>
       <w:pPr>
@@ -22,7 +22,7 @@
         <mc:AlternateContent>
           <mc:Choice Requires="wps">
             <w:drawing>
-              <wp:anchor distT="45720" distB="45720" distL="114300" distR="114300" simplePos="0" relativeHeight="251660288" behindDoc="0" locked="0" layoutInCell="1" allowOverlap="1" wp14:anchorId="7F825929" wp14:editId="16DB8824">
+              <wp:anchor distT="45720" distB="45720" distL="114300" distR="114300" simplePos="0" relativeHeight="251660288" behindDoc="0" locked="0" layoutInCell="1" allowOverlap="1" wp14:anchorId="7F825929" wp14:editId="701BA227">
                 <wp:simplePos x="0" y="0"/>
                 <wp:positionH relativeFrom="column">
                   <wp:align>right</wp:align>
@@ -30,7 +30,7 @@
                 <wp:positionV relativeFrom="paragraph">
                   <wp:posOffset>9525</wp:posOffset>
                 </wp:positionV>
-                <wp:extent cx="609600" cy="1404620"/>
+                <wp:extent cx="609600" cy="304800"/>
                 <wp:effectExtent l="0" t="0" r="0" b="0"/>
                 <wp:wrapNone/>
                 <wp:docPr id="217" name="Text Box 3"/>
@@ -46,7 +46,7 @@
                       <wps:spPr bwMode="auto">
                         <a:xfrm>
                           <a:off x="0" y="0"/>
-                          <a:ext cx="609600" cy="1404620"/>
+                          <a:ext cx="609600" cy="304800"/>
                         </a:xfrm>
                         <a:prstGeom prst="rect">
                           <a:avLst/>
@@ -72,11 +72,21 @@
                               </w:rPr>
                               <w:t xml:space="preserve">D- </w:t>
                             </w:r>
+                            <w:r>
+                              <w:rPr>
+                                <w:rFonts w:ascii="Times New Roman" w:hAnsi="Times New Roman"/>
+                                <w:b/>
+                                <w:bCs/>
+                                <w:sz w:val="28"/>
+                                <w:szCs w:val="28"/>
+                              </w:rPr>
+                              <w:t>21</w:t>
+                            </w:r>
                           </w:p>
                         </w:txbxContent>
                       </wps:txbx>
                       <wps:bodyPr rot="0" vert="horz" wrap="square" lIns="91440" tIns="45720" rIns="91440" bIns="45720" anchor="t" anchorCtr="0">
-                        <a:spAutoFit/>
+                        <a:noAutofit/>
                       </wps:bodyPr>
                     </wps:wsp>
                   </a:graphicData>
@@ -85,19 +95,19 @@
                   <wp14:pctWidth>0</wp14:pctWidth>
                 </wp14:sizeRelH>
                 <wp14:sizeRelV relativeFrom="margin">
-                  <wp14:pctHeight>20000</wp14:pctHeight>
+                  <wp14:pctHeight>0</wp14:pctHeight>
                 </wp14:sizeRelV>
               </wp:anchor>
             </w:drawing>
           </mc:Choice>
-          <mc:Fallback xmlns:cx2="http://schemas.microsoft.com/office/drawing/2015/10/21/chartex" xmlns:cx3="http://schemas.microsoft.com/office/drawing/2016/5/9/chartex" xmlns:cx4="http://schemas.microsoft.com/office/drawing/2016/5/10/chartex" xmlns:cx5="http://schemas.microsoft.com/office/drawing/2016/5/11/chartex" xmlns:cx6="http://schemas.microsoft.com/office/drawing/2016/5/12/chartex" xmlns:cx7="http://schemas.microsoft.com/office/drawing/2016/5/13/chartex" xmlns:cx8="http://schemas.microsoft.com/office/drawing/2016/5/14/chartex" xmlns:aink="http://schemas.microsoft.com/office/drawing/2016/ink" xmlns:am3d="http://schemas.microsoft.com/office/drawing/2017/model3d" xmlns:oel="http://schemas.microsoft.com/office/2019/extlst" xmlns:w16cex="http://schemas.microsoft.com/office/word/2018/wordml/cex" xmlns:w16cid="http://schemas.microsoft.com/office/word/2016/wordml/cid" xmlns:w16="http://schemas.microsoft.com/office/word/2018/wordml" xmlns:w16du="http://schemas.microsoft.com/office/word/2023/wordml/word16du" xmlns:w16sdtdh="http://schemas.microsoft.com/office/word/2020/wordml/sdtdatahash">
+          <mc:Fallback>
             <w:pict>
               <v:shapetype w14:anchorId="7F825929" id="_x0000_t202" coordsize="21600,21600" o:spt="202" path="m,l,21600r21600,l21600,xe">
                 <v:stroke joinstyle="miter"/>
                 <v:path gradientshapeok="t" o:connecttype="rect"/>
               </v:shapetype>
-              <v:shape id="Text Box 3" o:spid="_x0000_s1026" type="#_x0000_t202" style="position:absolute;left:0;text-align:left;margin-left:-3.2pt;margin-top:.75pt;width:48pt;height:110.6pt;z-index:251660288;visibility:visible;mso-wrap-style:square;mso-width-percent:0;mso-height-percent:200;mso-wrap-distance-left:9pt;mso-wrap-distance-top:3.6pt;mso-wrap-distance-right:9pt;mso-wrap-distance-bottom:3.6pt;mso-position-horizontal:right;mso-position-horizontal-relative:text;mso-position-vertical:absolute;mso-position-vertical-relative:text;mso-width-percent:0;mso-height-percent:200;mso-width-relative:margin;mso-height-relative:margin;v-text-anchor:top" o:gfxdata="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" filled="f" stroked="f">
-                <v:textbox style="mso-fit-shape-to-text:t">
+              <v:shape id="Text Box 3" o:spid="_x0000_s1026" type="#_x0000_t202" style="position:absolute;left:0;text-align:left;margin-left:-3.2pt;margin-top:.75pt;width:48pt;height:24pt;z-index:251660288;visibility:visible;mso-wrap-style:square;mso-width-percent:0;mso-height-percent:0;mso-wrap-distance-left:9pt;mso-wrap-distance-top:3.6pt;mso-wrap-distance-right:9pt;mso-wrap-distance-bottom:3.6pt;mso-position-horizontal:right;mso-position-horizontal-relative:text;mso-position-vertical:absolute;mso-position-vertical-relative:text;mso-width-percent:0;mso-height-percent:0;mso-width-relative:margin;mso-height-relative:margin;v-text-anchor:top" o:gfxdata="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" filled="f" stroked="f">
+                <v:textbox>
                   <w:txbxContent>
                     <w:p>
                       <w:r>
@@ -109,6 +119,16 @@
                           <w:szCs w:val="28"/>
                         </w:rPr>
                         <w:t xml:space="preserve">D- </w:t>
+                      </w:r>
+                      <w:r>
+                        <w:rPr>
+                          <w:rFonts w:ascii="Times New Roman" w:hAnsi="Times New Roman"/>
+                          <w:b/>
+                          <w:bCs/>
+                          <w:sz w:val="28"/>
+                          <w:szCs w:val="28"/>
+                        </w:rPr>
+                        <w:t>21</w:t>
                       </w:r>
                     </w:p>
                   </w:txbxContent>
@@ -212,7 +232,27 @@
           <w:bCs/>
           <w:sz w:val="20"/>
         </w:rPr>
-        <w:t>Ratnanagar-7, Sauraha, Chitwan</w:t>
+        <w:t xml:space="preserve">Ratnanagar-7, </w:t>
+      </w:r>
+      <w:proofErr w:type="spellStart"/>
+      <w:r>
+        <w:rPr>
+          <w:rFonts w:ascii="Times New Roman" w:hAnsi="Times New Roman"/>
+          <w:b/>
+          <w:bCs/>
+          <w:sz w:val="20"/>
+        </w:rPr>
+        <w:t>Sauraha</w:t>
+      </w:r>
+      <w:proofErr w:type="spellEnd"/>
+      <w:r>
+        <w:rPr>
+          <w:rFonts w:ascii="Times New Roman" w:hAnsi="Times New Roman"/>
+          <w:b/>
+          <w:bCs/>
+          <w:sz w:val="20"/>
+        </w:rPr>
+        <w:t>, Chitwan</w:t>
       </w:r>
     </w:p>
     <w:p>
@@ -351,7 +391,7 @@
           <w:sz w:val="24"/>
           <w:szCs w:val="24"/>
         </w:rPr>
-        <w:t>2</w:t>
+        <w:t xml:space="preserve"> </w:t>
       </w:r>
       <w:r>
         <w:rPr>
@@ -361,7 +401,7 @@
           <w:sz w:val="24"/>
           <w:szCs w:val="24"/>
         </w:rPr>
-        <w:t xml:space="preserve"> hrs.</w:t>
+        <w:t>2</w:t>
       </w:r>
       <w:r>
         <w:rPr>
@@ -371,7 +411,7 @@
           <w:sz w:val="24"/>
           <w:szCs w:val="24"/>
         </w:rPr>
-        <w:tab/>
+        <w:t xml:space="preserve"> hrs.</w:t>
       </w:r>
       <w:r>
         <w:rPr>
@@ -456,7 +496,7 @@
           <w:sz w:val="24"/>
           <w:szCs w:val="24"/>
         </w:rPr>
-        <w:t>English</w:t>
+        <w:t xml:space="preserve"> </w:t>
       </w:r>
       <w:r>
         <w:rPr>
@@ -466,7 +506,7 @@
           <w:sz w:val="24"/>
           <w:szCs w:val="24"/>
         </w:rPr>
-        <w:t xml:space="preserve"> </w:t>
+        <w:t>English</w:t>
       </w:r>
       <w:r>
         <w:rPr>
@@ -476,7 +516,7 @@
           <w:sz w:val="24"/>
           <w:szCs w:val="24"/>
         </w:rPr>
-        <w:tab/>
+        <w:t xml:space="preserve"> </w:t>
       </w:r>
       <w:r>
         <w:rPr>
@@ -548,28 +588,58 @@
         </w:rPr>
         <w:tab/>
       </w:r>
-    </w:p>
-    <w:p>
-      <w:pPr>
-        <w:spacing w:after="0" w:line="240" w:lineRule="auto"/>
-        <w:jc w:val="both"/>
-        <w:rPr>
-          <w:rFonts w:ascii="Times New Roman" w:eastAsia="Times New Roman" w:hAnsi="Times New Roman" w:cs="Times New Roman"/>
-          <w:b/>
-          <w:sz w:val="28"/>
-          <w:szCs w:val="28"/>
-          <w:lang w:val="en-US" w:bidi="ar-SA"/>
-        </w:rPr>
-      </w:pPr>
-      <w:r>
-        <w:rPr>
-          <w:rFonts w:ascii="Times New Roman" w:eastAsia="Times New Roman" w:hAnsi="Times New Roman" w:cs="Times New Roman"/>
-          <w:b/>
-          <w:sz w:val="28"/>
-          <w:szCs w:val="28"/>
-          <w:lang w:val="en-US" w:bidi="ar-SA"/>
-        </w:rPr>
-        <w:t>1.Read the given passage and do the activities below.</w:t>
+      <w:r>
+        <w:rPr>
+          <w:rFonts w:ascii="Times New Roman" w:hAnsi="Times New Roman"/>
+          <w:b/>
+          <w:bCs/>
+          <w:sz w:val="24"/>
+          <w:szCs w:val="24"/>
+        </w:rPr>
+        <w:tab/>
+      </w:r>
+    </w:p>
+    <w:p>
+      <w:pPr>
+        <w:spacing w:after="0" w:line="240" w:lineRule="auto"/>
+        <w:jc w:val="both"/>
+        <w:rPr>
+          <w:rFonts w:ascii="Times New Roman" w:eastAsia="Times New Roman" w:hAnsi="Times New Roman" w:cs="Times New Roman"/>
+          <w:b/>
+          <w:sz w:val="28"/>
+          <w:szCs w:val="28"/>
+          <w:lang w:val="en-US" w:bidi="ar-SA"/>
+        </w:rPr>
+      </w:pPr>
+      <w:r>
+        <w:rPr>
+          <w:rFonts w:ascii="Times New Roman" w:eastAsia="Times New Roman" w:hAnsi="Times New Roman" w:cs="Times New Roman"/>
+          <w:b/>
+          <w:sz w:val="28"/>
+          <w:szCs w:val="28"/>
+          <w:lang w:val="en-US" w:bidi="ar-SA"/>
+        </w:rPr>
+        <w:t>1.</w:t>
+      </w:r>
+      <w:r>
+        <w:rPr>
+          <w:rFonts w:ascii="Times New Roman" w:eastAsia="Times New Roman" w:hAnsi="Times New Roman" w:cs="Times New Roman"/>
+          <w:b/>
+          <w:sz w:val="28"/>
+          <w:szCs w:val="28"/>
+          <w:lang w:val="en-US" w:bidi="ar-SA"/>
+        </w:rPr>
+        <w:t xml:space="preserve"> </w:t>
+      </w:r>
+      <w:r>
+        <w:rPr>
+          <w:rFonts w:ascii="Times New Roman" w:eastAsia="Times New Roman" w:hAnsi="Times New Roman" w:cs="Times New Roman"/>
+          <w:b/>
+          <w:sz w:val="28"/>
+          <w:szCs w:val="28"/>
+          <w:lang w:val="en-US" w:bidi="ar-SA"/>
+        </w:rPr>
+        <w:t>Read the given passage and do the activities below.</w:t>
       </w:r>
     </w:p>
     <w:p>
@@ -592,51 +662,129 @@
         </w:rPr>
         <w:t>Mahabir Pu</w:t>
       </w:r>
-      <w:bookmarkStart w:id="0" w:name="_GoBack"/>
-      <w:bookmarkEnd w:id="0"/>
-      <w:r>
-        <w:rPr>
-          <w:rFonts w:ascii="Times New Roman" w:eastAsia="Times New Roman" w:hAnsi="Times New Roman" w:cs="Times New Roman"/>
-          <w:sz w:val="28"/>
-          <w:szCs w:val="28"/>
-          <w:lang w:val="en-US" w:bidi="ar-SA"/>
-        </w:rPr>
-        <w:t>n is a Nepalese teacher, social entrepreneur, innovator and social activist. He is the initiator of the Nepal Wireless Networking Project. He works for income-generation initiatives to villagers and fund schools. He has built community-run schools that improve the quality of education, bring job opportunities to villages, and decrease migration to urban centres. His work is inspiring many youths to serve the country. He is the founder of a nonprofit organization named "Rashtriya Abiskar Kendra" (National Innovation Centre) established in 2012. He is running a crowd funding campaign to fund National Innovation efforts.</w:t>
-      </w:r>
-    </w:p>
-    <w:p>
-      <w:pPr>
-        <w:spacing w:after="0" w:line="240" w:lineRule="auto"/>
-        <w:jc w:val="both"/>
-        <w:rPr>
-          <w:rFonts w:ascii="Times New Roman" w:eastAsia="Times New Roman" w:hAnsi="Times New Roman" w:cs="Times New Roman"/>
-          <w:sz w:val="28"/>
-          <w:szCs w:val="28"/>
-          <w:lang w:val="en-US" w:bidi="ar-SA"/>
-        </w:rPr>
-      </w:pPr>
-    </w:p>
-    <w:p>
-      <w:pPr>
-        <w:spacing w:after="0" w:line="240" w:lineRule="auto"/>
-        <w:jc w:val="both"/>
-        <w:rPr>
-          <w:rFonts w:ascii="Times New Roman" w:eastAsia="Times New Roman" w:hAnsi="Times New Roman" w:cs="Times New Roman"/>
-          <w:b/>
-          <w:sz w:val="28"/>
-          <w:szCs w:val="28"/>
-          <w:lang w:val="en-US" w:bidi="ar-SA"/>
-        </w:rPr>
-      </w:pPr>
-      <w:r>
-        <w:rPr>
-          <w:rFonts w:ascii="Times New Roman" w:eastAsia="Times New Roman" w:hAnsi="Times New Roman" w:cs="Times New Roman"/>
-          <w:b/>
-          <w:sz w:val="28"/>
-          <w:szCs w:val="28"/>
-          <w:lang w:val="en-US" w:bidi="ar-SA"/>
-        </w:rPr>
-        <w:t xml:space="preserve">A.Write True or False. </w:t>
+      <w:r>
+        <w:rPr>
+          <w:rFonts w:ascii="Times New Roman" w:eastAsia="Times New Roman" w:hAnsi="Times New Roman" w:cs="Times New Roman"/>
+          <w:sz w:val="28"/>
+          <w:szCs w:val="28"/>
+          <w:lang w:val="en-US" w:bidi="ar-SA"/>
+        </w:rPr>
+        <w:t xml:space="preserve">n is a Nepalese teacher, social entrepreneur, innovator and social activist. He is the initiator of the Nepal Wireless Networking Project. He works for income-generation initiatives to villagers and fund schools. He has built community-run schools that improve the quality of education, bring job opportunities to villages, and decrease migration to urban </w:t>
+      </w:r>
+      <w:proofErr w:type="spellStart"/>
+      <w:r>
+        <w:rPr>
+          <w:rFonts w:ascii="Times New Roman" w:eastAsia="Times New Roman" w:hAnsi="Times New Roman" w:cs="Times New Roman"/>
+          <w:sz w:val="28"/>
+          <w:szCs w:val="28"/>
+          <w:lang w:val="en-US" w:bidi="ar-SA"/>
+        </w:rPr>
+        <w:t>centres</w:t>
+      </w:r>
+      <w:proofErr w:type="spellEnd"/>
+      <w:r>
+        <w:rPr>
+          <w:rFonts w:ascii="Times New Roman" w:eastAsia="Times New Roman" w:hAnsi="Times New Roman" w:cs="Times New Roman"/>
+          <w:sz w:val="28"/>
+          <w:szCs w:val="28"/>
+          <w:lang w:val="en-US" w:bidi="ar-SA"/>
+        </w:rPr>
+        <w:t>. His work is inspiring many youths to serve the country. He is the founder of a nonprofit organization named "</w:t>
+      </w:r>
+      <w:proofErr w:type="spellStart"/>
+      <w:r>
+        <w:rPr>
+          <w:rFonts w:ascii="Times New Roman" w:eastAsia="Times New Roman" w:hAnsi="Times New Roman" w:cs="Times New Roman"/>
+          <w:sz w:val="28"/>
+          <w:szCs w:val="28"/>
+          <w:lang w:val="en-US" w:bidi="ar-SA"/>
+        </w:rPr>
+        <w:t>Rashtriya</w:t>
+      </w:r>
+      <w:proofErr w:type="spellEnd"/>
+      <w:r>
+        <w:rPr>
+          <w:rFonts w:ascii="Times New Roman" w:eastAsia="Times New Roman" w:hAnsi="Times New Roman" w:cs="Times New Roman"/>
+          <w:sz w:val="28"/>
+          <w:szCs w:val="28"/>
+          <w:lang w:val="en-US" w:bidi="ar-SA"/>
+        </w:rPr>
+        <w:t xml:space="preserve"> </w:t>
+      </w:r>
+      <w:proofErr w:type="spellStart"/>
+      <w:r>
+        <w:rPr>
+          <w:rFonts w:ascii="Times New Roman" w:eastAsia="Times New Roman" w:hAnsi="Times New Roman" w:cs="Times New Roman"/>
+          <w:sz w:val="28"/>
+          <w:szCs w:val="28"/>
+          <w:lang w:val="en-US" w:bidi="ar-SA"/>
+        </w:rPr>
+        <w:t>Abiskar</w:t>
+      </w:r>
+      <w:proofErr w:type="spellEnd"/>
+      <w:r>
+        <w:rPr>
+          <w:rFonts w:ascii="Times New Roman" w:eastAsia="Times New Roman" w:hAnsi="Times New Roman" w:cs="Times New Roman"/>
+          <w:sz w:val="28"/>
+          <w:szCs w:val="28"/>
+          <w:lang w:val="en-US" w:bidi="ar-SA"/>
+        </w:rPr>
+        <w:t xml:space="preserve"> Kendra" (National Innovation Centre) established in 2012. He is running a crowd funding campaign to fund National Innovation efforts.</w:t>
+      </w:r>
+    </w:p>
+    <w:p>
+      <w:pPr>
+        <w:spacing w:after="0" w:line="240" w:lineRule="auto"/>
+        <w:jc w:val="both"/>
+        <w:rPr>
+          <w:rFonts w:ascii="Times New Roman" w:eastAsia="Times New Roman" w:hAnsi="Times New Roman" w:cs="Times New Roman"/>
+          <w:sz w:val="28"/>
+          <w:szCs w:val="28"/>
+          <w:lang w:val="en-US" w:bidi="ar-SA"/>
+        </w:rPr>
+      </w:pPr>
+    </w:p>
+    <w:p>
+      <w:pPr>
+        <w:spacing w:after="0" w:line="240" w:lineRule="auto"/>
+        <w:jc w:val="both"/>
+        <w:rPr>
+          <w:rFonts w:ascii="Times New Roman" w:eastAsia="Times New Roman" w:hAnsi="Times New Roman" w:cs="Times New Roman"/>
+          <w:b/>
+          <w:sz w:val="28"/>
+          <w:szCs w:val="28"/>
+          <w:lang w:val="en-US" w:bidi="ar-SA"/>
+        </w:rPr>
+      </w:pPr>
+      <w:r>
+        <w:rPr>
+          <w:rFonts w:ascii="Times New Roman" w:eastAsia="Times New Roman" w:hAnsi="Times New Roman" w:cs="Times New Roman"/>
+          <w:b/>
+          <w:sz w:val="28"/>
+          <w:szCs w:val="28"/>
+          <w:lang w:val="en-US" w:bidi="ar-SA"/>
+        </w:rPr>
+        <w:t>A.</w:t>
+      </w:r>
+      <w:r>
+        <w:rPr>
+          <w:rFonts w:ascii="Times New Roman" w:eastAsia="Times New Roman" w:hAnsi="Times New Roman" w:cs="Times New Roman"/>
+          <w:b/>
+          <w:sz w:val="28"/>
+          <w:szCs w:val="28"/>
+          <w:lang w:val="en-US" w:bidi="ar-SA"/>
+        </w:rPr>
+        <w:t xml:space="preserve"> </w:t>
+      </w:r>
+      <w:r>
+        <w:rPr>
+          <w:rFonts w:ascii="Times New Roman" w:eastAsia="Times New Roman" w:hAnsi="Times New Roman" w:cs="Times New Roman"/>
+          <w:b/>
+          <w:sz w:val="28"/>
+          <w:szCs w:val="28"/>
+          <w:lang w:val="en-US" w:bidi="ar-SA"/>
+        </w:rPr>
+        <w:t xml:space="preserve">Write True or False. </w:t>
       </w:r>
       <w:r>
         <w:rPr>
@@ -670,14 +818,25 @@
           <w:lang w:val="en-US" w:bidi="ar-SA"/>
         </w:rPr>
       </w:pPr>
-      <w:r>
-        <w:rPr>
-          <w:rFonts w:ascii="Times New Roman" w:eastAsia="Times New Roman" w:hAnsi="Times New Roman" w:cs="Times New Roman"/>
-          <w:sz w:val="28"/>
-          <w:szCs w:val="28"/>
-          <w:lang w:val="en-US" w:bidi="ar-SA"/>
-        </w:rPr>
-        <w:t>i) Mahabir Pun is a Nepalese teacher.</w:t>
+      <w:proofErr w:type="spellStart"/>
+      <w:r>
+        <w:rPr>
+          <w:rFonts w:ascii="Times New Roman" w:eastAsia="Times New Roman" w:hAnsi="Times New Roman" w:cs="Times New Roman"/>
+          <w:sz w:val="28"/>
+          <w:szCs w:val="28"/>
+          <w:lang w:val="en-US" w:bidi="ar-SA"/>
+        </w:rPr>
+        <w:t>i</w:t>
+      </w:r>
+      <w:proofErr w:type="spellEnd"/>
+      <w:r>
+        <w:rPr>
+          <w:rFonts w:ascii="Times New Roman" w:eastAsia="Times New Roman" w:hAnsi="Times New Roman" w:cs="Times New Roman"/>
+          <w:sz w:val="28"/>
+          <w:szCs w:val="28"/>
+          <w:lang w:val="en-US" w:bidi="ar-SA"/>
+        </w:rPr>
+        <w:t>) Mahabir Pun is a Nepalese teacher.</w:t>
       </w:r>
     </w:p>
     <w:p>
@@ -719,7 +878,25 @@
           <w:szCs w:val="28"/>
           <w:lang w:val="en-US" w:bidi="ar-SA"/>
         </w:rPr>
-        <w:t>iii) He is the founder of a non profit organization.</w:t>
+        <w:t xml:space="preserve">iii) He is the founder of a </w:t>
+      </w:r>
+      <w:r>
+        <w:rPr>
+          <w:rFonts w:ascii="Times New Roman" w:eastAsia="Times New Roman" w:hAnsi="Times New Roman" w:cs="Times New Roman"/>
+          <w:sz w:val="28"/>
+          <w:szCs w:val="28"/>
+          <w:lang w:val="en-US" w:bidi="ar-SA"/>
+        </w:rPr>
+        <w:t>non-profit</w:t>
+      </w:r>
+      <w:r>
+        <w:rPr>
+          <w:rFonts w:ascii="Times New Roman" w:eastAsia="Times New Roman" w:hAnsi="Times New Roman" w:cs="Times New Roman"/>
+          <w:sz w:val="28"/>
+          <w:szCs w:val="28"/>
+          <w:lang w:val="en-US" w:bidi="ar-SA"/>
+        </w:rPr>
+        <w:t xml:space="preserve"> organization.</w:t>
       </w:r>
     </w:p>
     <w:p>
@@ -761,63 +938,121 @@
           <w:szCs w:val="28"/>
           <w:lang w:val="en-US" w:bidi="ar-SA"/>
         </w:rPr>
-        <w:t>v.He has built community -run schools.</w:t>
-      </w:r>
-    </w:p>
-    <w:p>
-      <w:pPr>
-        <w:spacing w:after="0" w:line="240" w:lineRule="auto"/>
-        <w:jc w:val="both"/>
-        <w:rPr>
-          <w:rFonts w:ascii="Times New Roman" w:eastAsia="Times New Roman" w:hAnsi="Times New Roman" w:cs="Times New Roman"/>
-          <w:sz w:val="28"/>
-          <w:szCs w:val="28"/>
-          <w:lang w:val="en-US" w:bidi="ar-SA"/>
-        </w:rPr>
-      </w:pPr>
-    </w:p>
-    <w:p>
-      <w:pPr>
-        <w:spacing w:after="0" w:line="240" w:lineRule="auto"/>
-        <w:jc w:val="both"/>
-        <w:rPr>
-          <w:rFonts w:ascii="Times New Roman" w:eastAsia="Times New Roman" w:hAnsi="Times New Roman" w:cs="Times New Roman"/>
-          <w:b/>
-          <w:sz w:val="28"/>
-          <w:szCs w:val="28"/>
-          <w:lang w:val="en-US" w:bidi="ar-SA"/>
-        </w:rPr>
-      </w:pPr>
-      <w:r>
-        <w:rPr>
-          <w:rFonts w:ascii="Times New Roman" w:eastAsia="Times New Roman" w:hAnsi="Times New Roman" w:cs="Times New Roman"/>
-          <w:b/>
-          <w:sz w:val="28"/>
-          <w:szCs w:val="28"/>
-          <w:lang w:val="en-US" w:bidi="ar-SA"/>
-        </w:rPr>
-        <w:t>2.Read the following passage and do the activities below.</w:t>
-      </w:r>
-    </w:p>
-    <w:p>
-      <w:pPr>
-        <w:spacing w:after="0" w:line="240" w:lineRule="auto"/>
-        <w:jc w:val="both"/>
-        <w:rPr>
-          <w:rFonts w:ascii="Times New Roman" w:eastAsia="Times New Roman" w:hAnsi="Times New Roman" w:cs="Times New Roman"/>
-          <w:sz w:val="28"/>
-          <w:szCs w:val="28"/>
-          <w:lang w:val="en-US" w:bidi="ar-SA"/>
-        </w:rPr>
-      </w:pPr>
-      <w:r>
-        <w:rPr>
-          <w:rFonts w:ascii="Times New Roman" w:eastAsia="Times New Roman" w:hAnsi="Times New Roman" w:cs="Times New Roman"/>
-          <w:sz w:val="28"/>
-          <w:szCs w:val="28"/>
-          <w:lang w:val="en-US" w:bidi="ar-SA"/>
-        </w:rPr>
-        <w:t xml:space="preserve">Tim Berners-Lee is the inventor of the world wide web. He invented it in 1989. He was born in London on June 8, 1955. His parents were mathematicians who worked on the Mark I computer. They encouraged Tim's interest in maths and electronics. He majored in Physics at Queen's college, Oxford while he was there, he built his own computer out of the spare </w:t>
+        <w:t>v</w:t>
+      </w:r>
+      <w:r>
+        <w:rPr>
+          <w:rFonts w:ascii="Times New Roman" w:eastAsia="Times New Roman" w:hAnsi="Times New Roman" w:cs="Times New Roman"/>
+          <w:sz w:val="28"/>
+          <w:szCs w:val="28"/>
+          <w:lang w:val="en-US" w:bidi="ar-SA"/>
+        </w:rPr>
+        <w:t xml:space="preserve">) </w:t>
+      </w:r>
+      <w:r>
+        <w:rPr>
+          <w:rFonts w:ascii="Times New Roman" w:eastAsia="Times New Roman" w:hAnsi="Times New Roman" w:cs="Times New Roman"/>
+          <w:sz w:val="28"/>
+          <w:szCs w:val="28"/>
+          <w:lang w:val="en-US" w:bidi="ar-SA"/>
+        </w:rPr>
+        <w:t>He has built community -run schools.</w:t>
+      </w:r>
+    </w:p>
+    <w:p>
+      <w:pPr>
+        <w:spacing w:after="0" w:line="240" w:lineRule="auto"/>
+        <w:jc w:val="both"/>
+        <w:rPr>
+          <w:rFonts w:ascii="Times New Roman" w:eastAsia="Times New Roman" w:hAnsi="Times New Roman" w:cs="Times New Roman"/>
+          <w:sz w:val="28"/>
+          <w:szCs w:val="28"/>
+          <w:lang w:val="en-US" w:bidi="ar-SA"/>
+        </w:rPr>
+      </w:pPr>
+    </w:p>
+    <w:p>
+      <w:pPr>
+        <w:spacing w:after="0" w:line="240" w:lineRule="auto"/>
+        <w:jc w:val="both"/>
+        <w:rPr>
+          <w:rFonts w:ascii="Times New Roman" w:eastAsia="Times New Roman" w:hAnsi="Times New Roman" w:cs="Times New Roman"/>
+          <w:b/>
+          <w:sz w:val="28"/>
+          <w:szCs w:val="28"/>
+          <w:lang w:val="en-US" w:bidi="ar-SA"/>
+        </w:rPr>
+      </w:pPr>
+      <w:r>
+        <w:rPr>
+          <w:rFonts w:ascii="Times New Roman" w:eastAsia="Times New Roman" w:hAnsi="Times New Roman" w:cs="Times New Roman"/>
+          <w:b/>
+          <w:sz w:val="28"/>
+          <w:szCs w:val="28"/>
+          <w:lang w:val="en-US" w:bidi="ar-SA"/>
+        </w:rPr>
+        <w:t>2.</w:t>
+      </w:r>
+      <w:r>
+        <w:rPr>
+          <w:rFonts w:ascii="Times New Roman" w:eastAsia="Times New Roman" w:hAnsi="Times New Roman" w:cs="Times New Roman"/>
+          <w:b/>
+          <w:sz w:val="28"/>
+          <w:szCs w:val="28"/>
+          <w:lang w:val="en-US" w:bidi="ar-SA"/>
+        </w:rPr>
+        <w:t xml:space="preserve"> </w:t>
+      </w:r>
+      <w:r>
+        <w:rPr>
+          <w:rFonts w:ascii="Times New Roman" w:eastAsia="Times New Roman" w:hAnsi="Times New Roman" w:cs="Times New Roman"/>
+          <w:b/>
+          <w:sz w:val="28"/>
+          <w:szCs w:val="28"/>
+          <w:lang w:val="en-US" w:bidi="ar-SA"/>
+        </w:rPr>
+        <w:t>Read the following passage and do the activities below.</w:t>
+      </w:r>
+    </w:p>
+    <w:p>
+      <w:pPr>
+        <w:spacing w:after="0" w:line="240" w:lineRule="auto"/>
+        <w:jc w:val="both"/>
+        <w:rPr>
+          <w:rFonts w:ascii="Times New Roman" w:eastAsia="Times New Roman" w:hAnsi="Times New Roman" w:cs="Times New Roman"/>
+          <w:sz w:val="28"/>
+          <w:szCs w:val="28"/>
+          <w:lang w:val="en-US" w:bidi="ar-SA"/>
+        </w:rPr>
+      </w:pPr>
+      <w:r>
+        <w:rPr>
+          <w:rFonts w:ascii="Times New Roman" w:eastAsia="Times New Roman" w:hAnsi="Times New Roman" w:cs="Times New Roman"/>
+          <w:sz w:val="28"/>
+          <w:szCs w:val="28"/>
+          <w:lang w:val="en-US" w:bidi="ar-SA"/>
+        </w:rPr>
+        <w:t xml:space="preserve">Tim Berners-Lee is the inventor of the world wide web. He invented it in 1989. He was born in London on June 8, 1955. His parents were mathematicians who worked on the Mark I computer. They encouraged Tim's interest in </w:t>
+      </w:r>
+      <w:proofErr w:type="spellStart"/>
+      <w:r>
+        <w:rPr>
+          <w:rFonts w:ascii="Times New Roman" w:eastAsia="Times New Roman" w:hAnsi="Times New Roman" w:cs="Times New Roman"/>
+          <w:sz w:val="28"/>
+          <w:szCs w:val="28"/>
+          <w:lang w:val="en-US" w:bidi="ar-SA"/>
+        </w:rPr>
+        <w:t>maths</w:t>
+      </w:r>
+      <w:proofErr w:type="spellEnd"/>
+      <w:r>
+        <w:rPr>
+          <w:rFonts w:ascii="Times New Roman" w:eastAsia="Times New Roman" w:hAnsi="Times New Roman" w:cs="Times New Roman"/>
+          <w:sz w:val="28"/>
+          <w:szCs w:val="28"/>
+          <w:lang w:val="en-US" w:bidi="ar-SA"/>
+        </w:rPr>
+        <w:t xml:space="preserve"> and electronics. He majored in Physics at Queen's college, Oxford while he was there, he built his own computer out of the spare </w:t>
       </w:r>
       <w:r>
         <w:rPr>
@@ -832,7 +1067,6 @@
     <w:p>
       <w:pPr>
         <w:spacing w:after="0" w:line="240" w:lineRule="auto"/>
-        <w:jc w:val="both"/>
         <w:rPr>
           <w:rFonts w:ascii="Times New Roman" w:eastAsia="Times New Roman" w:hAnsi="Times New Roman" w:cs="Times New Roman"/>
           <w:b/>
@@ -869,28 +1103,39 @@
           <w:szCs w:val="28"/>
           <w:lang w:val="en-US" w:bidi="ar-SA"/>
         </w:rPr>
-        <w:t xml:space="preserve"> ( 5×1=5)</w:t>
-      </w:r>
-    </w:p>
-    <w:p>
-      <w:pPr>
-        <w:spacing w:after="0" w:line="240" w:lineRule="auto"/>
-        <w:jc w:val="both"/>
-        <w:rPr>
-          <w:rFonts w:ascii="Times New Roman" w:eastAsia="Times New Roman" w:hAnsi="Times New Roman" w:cs="Times New Roman"/>
-          <w:sz w:val="28"/>
-          <w:szCs w:val="28"/>
-          <w:lang w:val="en-US" w:bidi="ar-SA"/>
-        </w:rPr>
-      </w:pPr>
-      <w:r>
-        <w:rPr>
-          <w:rFonts w:ascii="Times New Roman" w:eastAsia="Times New Roman" w:hAnsi="Times New Roman" w:cs="Times New Roman"/>
-          <w:sz w:val="28"/>
-          <w:szCs w:val="28"/>
-          <w:lang w:val="en-US" w:bidi="ar-SA"/>
-        </w:rPr>
-        <w:t>i) He invented .........</w:t>
+        <w:t xml:space="preserve"> (5×1=5)</w:t>
+      </w:r>
+    </w:p>
+    <w:p>
+      <w:pPr>
+        <w:spacing w:after="0" w:line="240" w:lineRule="auto"/>
+        <w:jc w:val="both"/>
+        <w:rPr>
+          <w:rFonts w:ascii="Times New Roman" w:eastAsia="Times New Roman" w:hAnsi="Times New Roman" w:cs="Times New Roman"/>
+          <w:sz w:val="28"/>
+          <w:szCs w:val="28"/>
+          <w:lang w:val="en-US" w:bidi="ar-SA"/>
+        </w:rPr>
+      </w:pPr>
+      <w:proofErr w:type="spellStart"/>
+      <w:r>
+        <w:rPr>
+          <w:rFonts w:ascii="Times New Roman" w:eastAsia="Times New Roman" w:hAnsi="Times New Roman" w:cs="Times New Roman"/>
+          <w:sz w:val="28"/>
+          <w:szCs w:val="28"/>
+          <w:lang w:val="en-US" w:bidi="ar-SA"/>
+        </w:rPr>
+        <w:t>i</w:t>
+      </w:r>
+      <w:proofErr w:type="spellEnd"/>
+      <w:r>
+        <w:rPr>
+          <w:rFonts w:ascii="Times New Roman" w:eastAsia="Times New Roman" w:hAnsi="Times New Roman" w:cs="Times New Roman"/>
+          <w:sz w:val="28"/>
+          <w:szCs w:val="28"/>
+          <w:lang w:val="en-US" w:bidi="ar-SA"/>
+        </w:rPr>
+        <w:t>) He invented .........</w:t>
       </w:r>
     </w:p>
     <w:p>
@@ -974,7 +1219,25 @@
           <w:szCs w:val="28"/>
           <w:lang w:val="en-US" w:bidi="ar-SA"/>
         </w:rPr>
-        <w:t>v.He was also caught...........and banned.</w:t>
+        <w:t>v</w:t>
+      </w:r>
+      <w:r>
+        <w:rPr>
+          <w:rFonts w:ascii="Times New Roman" w:eastAsia="Times New Roman" w:hAnsi="Times New Roman" w:cs="Times New Roman"/>
+          <w:sz w:val="28"/>
+          <w:szCs w:val="28"/>
+          <w:lang w:val="en-US" w:bidi="ar-SA"/>
+        </w:rPr>
+        <w:t xml:space="preserve">) </w:t>
+      </w:r>
+      <w:r>
+        <w:rPr>
+          <w:rFonts w:ascii="Times New Roman" w:eastAsia="Times New Roman" w:hAnsi="Times New Roman" w:cs="Times New Roman"/>
+          <w:sz w:val="28"/>
+          <w:szCs w:val="28"/>
+          <w:lang w:val="en-US" w:bidi="ar-SA"/>
+        </w:rPr>
+        <w:t>He was also caught...........and banned.</w:t>
       </w:r>
     </w:p>
     <w:p>
@@ -1030,24 +1293,65 @@
           <w:szCs w:val="28"/>
           <w:lang w:val="en-US" w:bidi="ar-SA"/>
         </w:rPr>
-        <w:t>Hannah Montana is a famous actress. She is from United States of America and she loves travelling. Hannah is planning to travel to Cuzco in Peru, she's going to travel next Friday and she's going to stay in Peru for three weeks. She's going to visit Sacsayhuaman and then Machu Picchu. She likes Peruvian culture, and she's going to eat a delicious Cuzco traditional food. Hannah has friends in Lima; so after Cuzco, she's going to go there and she is going to visit her friends, too. They live in San Luis and they are going to prepare a big welcome party for Hannah, they love her a lot and they are going to buy a lot of presents for her. After one week, she's going to travel to Arequipa, she is going to take a lot of pictures and she's going to buy some souvenirs and take them back to United States.</w:t>
-      </w:r>
-    </w:p>
-    <w:p>
-      <w:pPr>
-        <w:spacing w:after="0" w:line="240" w:lineRule="auto"/>
-        <w:jc w:val="both"/>
-        <w:rPr>
-          <w:rFonts w:ascii="Times New Roman" w:eastAsia="Times New Roman" w:hAnsi="Times New Roman" w:cs="Times New Roman"/>
-          <w:sz w:val="28"/>
-          <w:szCs w:val="28"/>
-          <w:lang w:val="en-US" w:bidi="ar-SA"/>
-        </w:rPr>
-      </w:pPr>
-    </w:p>
-    <w:p>
-      <w:pPr>
-        <w:spacing w:after="0" w:line="240" w:lineRule="auto"/>
+        <w:t xml:space="preserve">Hannah Montana is a famous actress. She is from United States of America and she loves travelling. Hannah is planning to travel to Cuzco in Peru, she's going to travel next Friday and she's going to stay in Peru for three weeks. She's going to visit Sacsayhuaman and then Machu Picchu. She likes Peruvian culture, and she's going to eat a delicious Cuzco traditional food. Hannah has friends in Lima; </w:t>
+      </w:r>
+      <w:proofErr w:type="gramStart"/>
+      <w:r>
+        <w:rPr>
+          <w:rFonts w:ascii="Times New Roman" w:eastAsia="Times New Roman" w:hAnsi="Times New Roman" w:cs="Times New Roman"/>
+          <w:sz w:val="28"/>
+          <w:szCs w:val="28"/>
+          <w:lang w:val="en-US" w:bidi="ar-SA"/>
+        </w:rPr>
+        <w:t>so</w:t>
+      </w:r>
+      <w:proofErr w:type="gramEnd"/>
+      <w:r>
+        <w:rPr>
+          <w:rFonts w:ascii="Times New Roman" w:eastAsia="Times New Roman" w:hAnsi="Times New Roman" w:cs="Times New Roman"/>
+          <w:sz w:val="28"/>
+          <w:szCs w:val="28"/>
+          <w:lang w:val="en-US" w:bidi="ar-SA"/>
+        </w:rPr>
+        <w:t xml:space="preserve"> after Cuzco, she's going to go there and she is going to visit her friends, too. They live in San Luis and they are going to prepare a big welcome party for </w:t>
+      </w:r>
+      <w:proofErr w:type="gramStart"/>
+      <w:r>
+        <w:rPr>
+          <w:rFonts w:ascii="Times New Roman" w:eastAsia="Times New Roman" w:hAnsi="Times New Roman" w:cs="Times New Roman"/>
+          <w:sz w:val="28"/>
+          <w:szCs w:val="28"/>
+          <w:lang w:val="en-US" w:bidi="ar-SA"/>
+        </w:rPr>
+        <w:t>Hannah,</w:t>
+      </w:r>
+      <w:proofErr w:type="gramEnd"/>
+      <w:r>
+        <w:rPr>
+          <w:rFonts w:ascii="Times New Roman" w:eastAsia="Times New Roman" w:hAnsi="Times New Roman" w:cs="Times New Roman"/>
+          <w:sz w:val="28"/>
+          <w:szCs w:val="28"/>
+          <w:lang w:val="en-US" w:bidi="ar-SA"/>
+        </w:rPr>
+        <w:t xml:space="preserve"> they love her a lot and they are going to buy a lot of presents for her. After one week, she's going to travel to Arequipa, she is going to take a lot of pictures and she's going to buy some souvenirs and take them back to United States.</w:t>
+      </w:r>
+    </w:p>
+    <w:p>
+      <w:pPr>
+        <w:spacing w:after="0" w:line="240" w:lineRule="auto"/>
+        <w:jc w:val="both"/>
+        <w:rPr>
+          <w:rFonts w:ascii="Times New Roman" w:eastAsia="Times New Roman" w:hAnsi="Times New Roman" w:cs="Times New Roman"/>
+          <w:sz w:val="28"/>
+          <w:szCs w:val="28"/>
+          <w:lang w:val="en-US" w:bidi="ar-SA"/>
+        </w:rPr>
+      </w:pPr>
+    </w:p>
+    <w:p>
+      <w:pPr>
+        <w:spacing w:after="0" w:line="240" w:lineRule="auto"/>
+        <w:ind w:left="360" w:hanging="360"/>
         <w:jc w:val="both"/>
         <w:rPr>
           <w:rFonts w:ascii="Times New Roman" w:eastAsia="Times New Roman" w:hAnsi="Times New Roman" w:cs="Times New Roman"/>
@@ -1164,6 +1468,7 @@
     <w:p>
       <w:pPr>
         <w:spacing w:after="0" w:line="240" w:lineRule="auto"/>
+        <w:ind w:left="270" w:hanging="270"/>
         <w:jc w:val="both"/>
         <w:rPr>
           <w:rFonts w:ascii="Times New Roman" w:eastAsia="Times New Roman" w:hAnsi="Times New Roman" w:cs="Times New Roman"/>
@@ -1209,45 +1514,42 @@
         <w:jc w:val="both"/>
         <w:rPr>
           <w:rFonts w:ascii="Times New Roman" w:eastAsia="Times New Roman" w:hAnsi="Times New Roman" w:cs="Times New Roman"/>
-          <w:sz w:val="28"/>
-          <w:szCs w:val="28"/>
-          <w:lang w:val="en-US" w:bidi="ar-SA"/>
-        </w:rPr>
-      </w:pPr>
-    </w:p>
-    <w:p>
-      <w:pPr>
-        <w:spacing w:after="0" w:line="240" w:lineRule="auto"/>
-        <w:jc w:val="both"/>
-        <w:rPr>
-          <w:rFonts w:ascii="Times New Roman" w:eastAsia="Times New Roman" w:hAnsi="Times New Roman" w:cs="Times New Roman"/>
-          <w:sz w:val="28"/>
-          <w:szCs w:val="28"/>
-          <w:lang w:val="en-US" w:bidi="ar-SA"/>
-        </w:rPr>
-      </w:pPr>
-    </w:p>
-    <w:p>
-      <w:pPr>
-        <w:spacing w:after="0" w:line="240" w:lineRule="auto"/>
-        <w:jc w:val="both"/>
-        <w:rPr>
-          <w:rFonts w:ascii="Times New Roman" w:eastAsia="Times New Roman" w:hAnsi="Times New Roman" w:cs="Times New Roman"/>
-          <w:b/>
-          <w:sz w:val="28"/>
-          <w:szCs w:val="28"/>
-          <w:lang w:val="en-US" w:bidi="ar-SA"/>
-        </w:rPr>
-      </w:pPr>
-      <w:r>
-        <w:rPr>
-          <w:rFonts w:ascii="Times New Roman" w:eastAsia="Times New Roman" w:hAnsi="Times New Roman" w:cs="Times New Roman"/>
-          <w:b/>
-          <w:sz w:val="28"/>
-          <w:szCs w:val="28"/>
-          <w:lang w:val="en-US" w:bidi="ar-SA"/>
-        </w:rPr>
-        <w:t>4.Read the following text and do the activities that follow: </w:t>
+          <w:b/>
+          <w:sz w:val="28"/>
+          <w:szCs w:val="28"/>
+          <w:lang w:val="en-US" w:bidi="ar-SA"/>
+        </w:rPr>
+      </w:pPr>
+      <w:r>
+        <w:rPr>
+          <w:rFonts w:ascii="Times New Roman" w:eastAsia="Times New Roman" w:hAnsi="Times New Roman" w:cs="Times New Roman"/>
+          <w:b/>
+          <w:sz w:val="28"/>
+          <w:szCs w:val="28"/>
+          <w:lang w:val="en-US" w:bidi="ar-SA"/>
+        </w:rPr>
+        <w:lastRenderedPageBreak/>
+        <w:t>4.</w:t>
+      </w:r>
+      <w:r>
+        <w:rPr>
+          <w:rFonts w:ascii="Times New Roman" w:eastAsia="Times New Roman" w:hAnsi="Times New Roman" w:cs="Times New Roman"/>
+          <w:b/>
+          <w:sz w:val="28"/>
+          <w:szCs w:val="28"/>
+          <w:lang w:val="en-US" w:bidi="ar-SA"/>
+        </w:rPr>
+        <w:t xml:space="preserve"> </w:t>
+      </w:r>
+      <w:r>
+        <w:rPr>
+          <w:rFonts w:ascii="Times New Roman" w:eastAsia="Times New Roman" w:hAnsi="Times New Roman" w:cs="Times New Roman"/>
+          <w:b/>
+          <w:sz w:val="28"/>
+          <w:szCs w:val="28"/>
+          <w:lang w:val="en-US" w:bidi="ar-SA"/>
+        </w:rPr>
+        <w:t>Read the following text and do the activities that follow: </w:t>
       </w:r>
     </w:p>
     <w:p>
@@ -1387,17 +1689,59 @@
           <w:szCs w:val="28"/>
           <w:lang w:val="en-US" w:bidi="ar-SA"/>
         </w:rPr>
-        <w:t>A .Answer the following questions:</w:t>
-      </w:r>
-      <w:r>
-        <w:rPr>
-          <w:rFonts w:ascii="Times New Roman" w:eastAsia="Times New Roman" w:hAnsi="Times New Roman" w:cs="Times New Roman"/>
-          <w:b/>
-          <w:sz w:val="28"/>
-          <w:szCs w:val="28"/>
-          <w:lang w:val="en-US" w:bidi="ar-SA"/>
-        </w:rPr>
-        <w:t xml:space="preserve">                             ( 5×2=10)</w:t>
+        <w:t>A.</w:t>
+      </w:r>
+      <w:r>
+        <w:rPr>
+          <w:rFonts w:ascii="Times New Roman" w:eastAsia="Times New Roman" w:hAnsi="Times New Roman" w:cs="Times New Roman"/>
+          <w:b/>
+          <w:sz w:val="28"/>
+          <w:szCs w:val="28"/>
+          <w:lang w:val="en-US" w:bidi="ar-SA"/>
+        </w:rPr>
+        <w:t xml:space="preserve"> </w:t>
+      </w:r>
+      <w:r>
+        <w:rPr>
+          <w:rFonts w:ascii="Times New Roman" w:eastAsia="Times New Roman" w:hAnsi="Times New Roman" w:cs="Times New Roman"/>
+          <w:b/>
+          <w:sz w:val="28"/>
+          <w:szCs w:val="28"/>
+          <w:lang w:val="en-US" w:bidi="ar-SA"/>
+        </w:rPr>
+        <w:t>Answer the following questions:</w:t>
+      </w:r>
+      <w:r>
+        <w:rPr>
+          <w:rFonts w:ascii="Times New Roman" w:eastAsia="Times New Roman" w:hAnsi="Times New Roman" w:cs="Times New Roman"/>
+          <w:b/>
+          <w:sz w:val="28"/>
+          <w:szCs w:val="28"/>
+          <w:lang w:val="en-US" w:bidi="ar-SA"/>
+        </w:rPr>
+        <w:t xml:space="preserve">                          </w:t>
+      </w:r>
+      <w:proofErr w:type="gramStart"/>
+      <w:r>
+        <w:rPr>
+          <w:rFonts w:ascii="Times New Roman" w:eastAsia="Times New Roman" w:hAnsi="Times New Roman" w:cs="Times New Roman"/>
+          <w:b/>
+          <w:sz w:val="28"/>
+          <w:szCs w:val="28"/>
+          <w:lang w:val="en-US" w:bidi="ar-SA"/>
+        </w:rPr>
+        <w:t xml:space="preserve">   (</w:t>
+      </w:r>
+      <w:proofErr w:type="gramEnd"/>
+      <w:r>
+        <w:rPr>
+          <w:rFonts w:ascii="Times New Roman" w:eastAsia="Times New Roman" w:hAnsi="Times New Roman" w:cs="Times New Roman"/>
+          <w:b/>
+          <w:sz w:val="28"/>
+          <w:szCs w:val="28"/>
+          <w:lang w:val="en-US" w:bidi="ar-SA"/>
+        </w:rPr>
+        <w:t>5×2=10)</w:t>
       </w:r>
     </w:p>
     <w:p>
@@ -1547,28 +1891,139 @@
           <w:szCs w:val="28"/>
           <w:lang w:val="en-US" w:bidi="ar-SA"/>
         </w:rPr>
-        <w:t xml:space="preserve">                              ( 10×0.5=5)</w:t>
-      </w:r>
-    </w:p>
-    <w:p>
-      <w:pPr>
-        <w:spacing w:after="0" w:line="240" w:lineRule="auto"/>
-        <w:jc w:val="both"/>
-        <w:rPr>
-          <w:rFonts w:ascii="Times New Roman" w:eastAsia="Times New Roman" w:hAnsi="Times New Roman" w:cs="Times New Roman"/>
-          <w:sz w:val="28"/>
-          <w:szCs w:val="28"/>
-          <w:lang w:val="en-US" w:bidi="ar-SA"/>
-        </w:rPr>
-      </w:pPr>
-      <w:r>
-        <w:rPr>
-          <w:rFonts w:ascii="Times New Roman" w:eastAsia="Times New Roman" w:hAnsi="Times New Roman" w:cs="Times New Roman"/>
-          <w:sz w:val="28"/>
-          <w:szCs w:val="28"/>
-          <w:lang w:val="en-US" w:bidi="ar-SA"/>
-        </w:rPr>
-        <w:t> anuradha koirala is A nepalese social activist and the founder of maiti nepal- a non-profit organization in nepal she works for victims of girls trafficking </w:t>
+        <w:t xml:space="preserve">                              (10×0.5=5)</w:t>
+      </w:r>
+    </w:p>
+    <w:p>
+      <w:pPr>
+        <w:spacing w:after="0" w:line="240" w:lineRule="auto"/>
+        <w:jc w:val="both"/>
+        <w:rPr>
+          <w:rFonts w:ascii="Times New Roman" w:eastAsia="Times New Roman" w:hAnsi="Times New Roman" w:cs="Times New Roman"/>
+          <w:sz w:val="28"/>
+          <w:szCs w:val="28"/>
+          <w:lang w:val="en-US" w:bidi="ar-SA"/>
+        </w:rPr>
+      </w:pPr>
+      <w:proofErr w:type="spellStart"/>
+      <w:r>
+        <w:rPr>
+          <w:rFonts w:ascii="Times New Roman" w:eastAsia="Times New Roman" w:hAnsi="Times New Roman" w:cs="Times New Roman"/>
+          <w:sz w:val="28"/>
+          <w:szCs w:val="28"/>
+          <w:lang w:val="en-US" w:bidi="ar-SA"/>
+        </w:rPr>
+        <w:t>anuradha</w:t>
+      </w:r>
+      <w:proofErr w:type="spellEnd"/>
+      <w:r>
+        <w:rPr>
+          <w:rFonts w:ascii="Times New Roman" w:eastAsia="Times New Roman" w:hAnsi="Times New Roman" w:cs="Times New Roman"/>
+          <w:sz w:val="28"/>
+          <w:szCs w:val="28"/>
+          <w:lang w:val="en-US" w:bidi="ar-SA"/>
+        </w:rPr>
+        <w:t xml:space="preserve"> </w:t>
+      </w:r>
+      <w:proofErr w:type="spellStart"/>
+      <w:r>
+        <w:rPr>
+          <w:rFonts w:ascii="Times New Roman" w:eastAsia="Times New Roman" w:hAnsi="Times New Roman" w:cs="Times New Roman"/>
+          <w:sz w:val="28"/>
+          <w:szCs w:val="28"/>
+          <w:lang w:val="en-US" w:bidi="ar-SA"/>
+        </w:rPr>
+        <w:t>koirala</w:t>
+      </w:r>
+      <w:proofErr w:type="spellEnd"/>
+      <w:r>
+        <w:rPr>
+          <w:rFonts w:ascii="Times New Roman" w:eastAsia="Times New Roman" w:hAnsi="Times New Roman" w:cs="Times New Roman"/>
+          <w:sz w:val="28"/>
+          <w:szCs w:val="28"/>
+          <w:lang w:val="en-US" w:bidi="ar-SA"/>
+        </w:rPr>
+        <w:t xml:space="preserve"> is A </w:t>
+      </w:r>
+      <w:proofErr w:type="spellStart"/>
+      <w:r>
+        <w:rPr>
+          <w:rFonts w:ascii="Times New Roman" w:eastAsia="Times New Roman" w:hAnsi="Times New Roman" w:cs="Times New Roman"/>
+          <w:sz w:val="28"/>
+          <w:szCs w:val="28"/>
+          <w:lang w:val="en-US" w:bidi="ar-SA"/>
+        </w:rPr>
+        <w:t>nepalese</w:t>
+      </w:r>
+      <w:proofErr w:type="spellEnd"/>
+      <w:r>
+        <w:rPr>
+          <w:rFonts w:ascii="Times New Roman" w:eastAsia="Times New Roman" w:hAnsi="Times New Roman" w:cs="Times New Roman"/>
+          <w:sz w:val="28"/>
+          <w:szCs w:val="28"/>
+          <w:lang w:val="en-US" w:bidi="ar-SA"/>
+        </w:rPr>
+        <w:t xml:space="preserve"> social activist and the founder of </w:t>
+      </w:r>
+      <w:proofErr w:type="spellStart"/>
+      <w:r>
+        <w:rPr>
+          <w:rFonts w:ascii="Times New Roman" w:eastAsia="Times New Roman" w:hAnsi="Times New Roman" w:cs="Times New Roman"/>
+          <w:sz w:val="28"/>
+          <w:szCs w:val="28"/>
+          <w:lang w:val="en-US" w:bidi="ar-SA"/>
+        </w:rPr>
+        <w:t>maiti</w:t>
+      </w:r>
+      <w:proofErr w:type="spellEnd"/>
+      <w:r>
+        <w:rPr>
+          <w:rFonts w:ascii="Times New Roman" w:eastAsia="Times New Roman" w:hAnsi="Times New Roman" w:cs="Times New Roman"/>
+          <w:sz w:val="28"/>
+          <w:szCs w:val="28"/>
+          <w:lang w:val="en-US" w:bidi="ar-SA"/>
+        </w:rPr>
+        <w:t xml:space="preserve"> </w:t>
+      </w:r>
+      <w:proofErr w:type="spellStart"/>
+      <w:r>
+        <w:rPr>
+          <w:rFonts w:ascii="Times New Roman" w:eastAsia="Times New Roman" w:hAnsi="Times New Roman" w:cs="Times New Roman"/>
+          <w:sz w:val="28"/>
+          <w:szCs w:val="28"/>
+          <w:lang w:val="en-US" w:bidi="ar-SA"/>
+        </w:rPr>
+        <w:t>nepal</w:t>
+      </w:r>
+      <w:proofErr w:type="spellEnd"/>
+      <w:r>
+        <w:rPr>
+          <w:rFonts w:ascii="Times New Roman" w:eastAsia="Times New Roman" w:hAnsi="Times New Roman" w:cs="Times New Roman"/>
+          <w:sz w:val="28"/>
+          <w:szCs w:val="28"/>
+          <w:lang w:val="en-US" w:bidi="ar-SA"/>
+        </w:rPr>
+        <w:t xml:space="preserve">- a non-profit organization in </w:t>
+      </w:r>
+      <w:proofErr w:type="spellStart"/>
+      <w:r>
+        <w:rPr>
+          <w:rFonts w:ascii="Times New Roman" w:eastAsia="Times New Roman" w:hAnsi="Times New Roman" w:cs="Times New Roman"/>
+          <w:sz w:val="28"/>
+          <w:szCs w:val="28"/>
+          <w:lang w:val="en-US" w:bidi="ar-SA"/>
+        </w:rPr>
+        <w:t>nepal</w:t>
+      </w:r>
+      <w:proofErr w:type="spellEnd"/>
+      <w:r>
+        <w:rPr>
+          <w:rFonts w:ascii="Times New Roman" w:eastAsia="Times New Roman" w:hAnsi="Times New Roman" w:cs="Times New Roman"/>
+          <w:sz w:val="28"/>
+          <w:szCs w:val="28"/>
+          <w:lang w:val="en-US" w:bidi="ar-SA"/>
+        </w:rPr>
+        <w:t xml:space="preserve"> she works for victims of girls trafficking </w:t>
       </w:r>
     </w:p>
     <w:p>
@@ -1613,49 +2068,85 @@
           <w:szCs w:val="28"/>
           <w:lang w:val="en-US" w:bidi="ar-SA"/>
         </w:rPr>
-        <w:t xml:space="preserve">       ( 5×1=5)</w:t>
-      </w:r>
-    </w:p>
-    <w:p>
-      <w:pPr>
-        <w:spacing w:after="0" w:line="240" w:lineRule="auto"/>
-        <w:jc w:val="both"/>
-        <w:rPr>
-          <w:rFonts w:ascii="Times New Roman" w:eastAsia="Times New Roman" w:hAnsi="Times New Roman" w:cs="Times New Roman"/>
-          <w:sz w:val="28"/>
-          <w:szCs w:val="28"/>
-          <w:lang w:val="en-US" w:bidi="ar-SA"/>
-        </w:rPr>
-      </w:pPr>
-      <w:r>
-        <w:rPr>
-          <w:rFonts w:ascii="Times New Roman" w:eastAsia="Times New Roman" w:hAnsi="Times New Roman" w:cs="Times New Roman"/>
-          <w:sz w:val="28"/>
-          <w:szCs w:val="28"/>
-          <w:lang w:val="en-US" w:bidi="ar-SA"/>
-        </w:rPr>
-        <w:t>a.punishment</w:t>
-      </w:r>
-    </w:p>
-    <w:p>
-      <w:pPr>
-        <w:spacing w:after="0" w:line="240" w:lineRule="auto"/>
-        <w:jc w:val="both"/>
-        <w:rPr>
-          <w:rFonts w:ascii="Times New Roman" w:eastAsia="Times New Roman" w:hAnsi="Times New Roman" w:cs="Times New Roman"/>
-          <w:sz w:val="28"/>
-          <w:szCs w:val="28"/>
-          <w:lang w:val="en-US" w:bidi="ar-SA"/>
-        </w:rPr>
-      </w:pPr>
-      <w:r>
-        <w:rPr>
-          <w:rFonts w:ascii="Times New Roman" w:eastAsia="Times New Roman" w:hAnsi="Times New Roman" w:cs="Times New Roman"/>
-          <w:sz w:val="28"/>
-          <w:szCs w:val="28"/>
-          <w:lang w:val="en-US" w:bidi="ar-SA"/>
-        </w:rPr>
-        <w:t>b.direction </w:t>
+        <w:t xml:space="preserve">       (5×1=5)</w:t>
+      </w:r>
+    </w:p>
+    <w:p>
+      <w:pPr>
+        <w:spacing w:after="0" w:line="240" w:lineRule="auto"/>
+        <w:jc w:val="both"/>
+        <w:rPr>
+          <w:rFonts w:ascii="Times New Roman" w:eastAsia="Times New Roman" w:hAnsi="Times New Roman" w:cs="Times New Roman"/>
+          <w:sz w:val="28"/>
+          <w:szCs w:val="28"/>
+          <w:lang w:val="en-US" w:bidi="ar-SA"/>
+        </w:rPr>
+      </w:pPr>
+      <w:r>
+        <w:rPr>
+          <w:rFonts w:ascii="Times New Roman" w:eastAsia="Times New Roman" w:hAnsi="Times New Roman" w:cs="Times New Roman"/>
+          <w:sz w:val="28"/>
+          <w:szCs w:val="28"/>
+          <w:lang w:val="en-US" w:bidi="ar-SA"/>
+        </w:rPr>
+        <w:t>a.</w:t>
+      </w:r>
+      <w:r>
+        <w:rPr>
+          <w:rFonts w:ascii="Times New Roman" w:eastAsia="Times New Roman" w:hAnsi="Times New Roman" w:cs="Times New Roman"/>
+          <w:sz w:val="28"/>
+          <w:szCs w:val="28"/>
+          <w:lang w:val="en-US" w:bidi="ar-SA"/>
+        </w:rPr>
+        <w:t xml:space="preserve"> </w:t>
+      </w:r>
+      <w:r>
+        <w:rPr>
+          <w:rFonts w:ascii="Times New Roman" w:eastAsia="Times New Roman" w:hAnsi="Times New Roman" w:cs="Times New Roman"/>
+          <w:sz w:val="28"/>
+          <w:szCs w:val="28"/>
+          <w:lang w:val="en-US" w:bidi="ar-SA"/>
+        </w:rPr>
+        <w:t>punishment</w:t>
+      </w:r>
+    </w:p>
+    <w:p>
+      <w:pPr>
+        <w:spacing w:after="0" w:line="240" w:lineRule="auto"/>
+        <w:jc w:val="both"/>
+        <w:rPr>
+          <w:rFonts w:ascii="Times New Roman" w:eastAsia="Times New Roman" w:hAnsi="Times New Roman" w:cs="Times New Roman"/>
+          <w:sz w:val="28"/>
+          <w:szCs w:val="28"/>
+          <w:lang w:val="en-US" w:bidi="ar-SA"/>
+        </w:rPr>
+      </w:pPr>
+      <w:r>
+        <w:rPr>
+          <w:rFonts w:ascii="Times New Roman" w:eastAsia="Times New Roman" w:hAnsi="Times New Roman" w:cs="Times New Roman"/>
+          <w:sz w:val="28"/>
+          <w:szCs w:val="28"/>
+          <w:lang w:val="en-US" w:bidi="ar-SA"/>
+        </w:rPr>
+        <w:t>b.</w:t>
+      </w:r>
+      <w:r>
+        <w:rPr>
+          <w:rFonts w:ascii="Times New Roman" w:eastAsia="Times New Roman" w:hAnsi="Times New Roman" w:cs="Times New Roman"/>
+          <w:sz w:val="28"/>
+          <w:szCs w:val="28"/>
+          <w:lang w:val="en-US" w:bidi="ar-SA"/>
+        </w:rPr>
+        <w:t xml:space="preserve"> </w:t>
+      </w:r>
+      <w:r>
+        <w:rPr>
+          <w:rFonts w:ascii="Times New Roman" w:eastAsia="Times New Roman" w:hAnsi="Times New Roman" w:cs="Times New Roman"/>
+          <w:sz w:val="28"/>
+          <w:szCs w:val="28"/>
+          <w:lang w:val="en-US" w:bidi="ar-SA"/>
+        </w:rPr>
+        <w:t>direction </w:t>
       </w:r>
     </w:p>
     <w:p>
@@ -1753,18 +2244,60 @@
           <w:szCs w:val="28"/>
           <w:lang w:val="en-US" w:bidi="ar-SA"/>
         </w:rPr>
-        <w:t>7.Write  a set of instruction</w:t>
-      </w:r>
-      <w:r>
-        <w:rPr>
-          <w:rFonts w:ascii="Times New Roman" w:eastAsia="Times New Roman" w:hAnsi="Times New Roman" w:cs="Times New Roman"/>
-          <w:b/>
-          <w:sz w:val="28"/>
-          <w:szCs w:val="28"/>
-          <w:lang w:val="en-US" w:bidi="ar-SA"/>
-        </w:rPr>
-        <w:t>s about how to make an omlette</w:t>
-      </w:r>
+        <w:t>7.</w:t>
+      </w:r>
+      <w:r>
+        <w:rPr>
+          <w:rFonts w:ascii="Times New Roman" w:eastAsia="Times New Roman" w:hAnsi="Times New Roman" w:cs="Times New Roman"/>
+          <w:b/>
+          <w:sz w:val="28"/>
+          <w:szCs w:val="28"/>
+          <w:lang w:val="en-US" w:bidi="ar-SA"/>
+        </w:rPr>
+        <w:t xml:space="preserve"> </w:t>
+      </w:r>
+      <w:r>
+        <w:rPr>
+          <w:rFonts w:ascii="Times New Roman" w:eastAsia="Times New Roman" w:hAnsi="Times New Roman" w:cs="Times New Roman"/>
+          <w:b/>
+          <w:sz w:val="28"/>
+          <w:szCs w:val="28"/>
+          <w:lang w:val="en-US" w:bidi="ar-SA"/>
+        </w:rPr>
+        <w:t>Write a</w:t>
+      </w:r>
+      <w:r>
+        <w:rPr>
+          <w:rFonts w:ascii="Times New Roman" w:eastAsia="Times New Roman" w:hAnsi="Times New Roman" w:cs="Times New Roman"/>
+          <w:b/>
+          <w:sz w:val="28"/>
+          <w:szCs w:val="28"/>
+          <w:lang w:val="en-US" w:bidi="ar-SA"/>
+        </w:rPr>
+        <w:t xml:space="preserve"> set of instruction</w:t>
+      </w:r>
+      <w:r>
+        <w:rPr>
+          <w:rFonts w:ascii="Times New Roman" w:eastAsia="Times New Roman" w:hAnsi="Times New Roman" w:cs="Times New Roman"/>
+          <w:b/>
+          <w:sz w:val="28"/>
+          <w:szCs w:val="28"/>
+          <w:lang w:val="en-US" w:bidi="ar-SA"/>
+        </w:rPr>
+        <w:t xml:space="preserve">s about how to make an </w:t>
+      </w:r>
+      <w:proofErr w:type="spellStart"/>
+      <w:r>
+        <w:rPr>
+          <w:rFonts w:ascii="Times New Roman" w:eastAsia="Times New Roman" w:hAnsi="Times New Roman" w:cs="Times New Roman"/>
+          <w:b/>
+          <w:sz w:val="28"/>
+          <w:szCs w:val="28"/>
+          <w:lang w:val="en-US" w:bidi="ar-SA"/>
+        </w:rPr>
+        <w:t>omlette</w:t>
+      </w:r>
+      <w:proofErr w:type="spellEnd"/>
       <w:r>
         <w:rPr>
           <w:rFonts w:ascii="Times New Roman" w:eastAsia="Times New Roman" w:hAnsi="Times New Roman" w:cs="Times New Roman"/>
@@ -1783,7 +2316,51 @@
           <w:szCs w:val="28"/>
           <w:lang w:val="en-US" w:bidi="ar-SA"/>
         </w:rPr>
-        <w:t xml:space="preserve"> 5</w:t>
+        <w:t xml:space="preserve"> </w:t>
+      </w:r>
+    </w:p>
+    <w:p>
+      <w:pPr>
+        <w:spacing w:after="0" w:line="240" w:lineRule="auto"/>
+        <w:ind w:left="6480"/>
+        <w:jc w:val="both"/>
+        <w:rPr>
+          <w:rFonts w:ascii="Times New Roman" w:eastAsia="Times New Roman" w:hAnsi="Times New Roman" w:cs="Times New Roman"/>
+          <w:b/>
+          <w:sz w:val="28"/>
+          <w:szCs w:val="28"/>
+          <w:lang w:val="en-US" w:bidi="ar-SA"/>
+        </w:rPr>
+      </w:pPr>
+      <w:r>
+        <w:rPr>
+          <w:rFonts w:ascii="Times New Roman" w:eastAsia="Times New Roman" w:hAnsi="Times New Roman" w:cs="Times New Roman"/>
+          <w:b/>
+          <w:sz w:val="28"/>
+          <w:szCs w:val="28"/>
+          <w:lang w:val="en-US" w:bidi="ar-SA"/>
+        </w:rPr>
+        <w:t xml:space="preserve">       (</w:t>
+      </w:r>
+      <w:r>
+        <w:rPr>
+          <w:rFonts w:ascii="Times New Roman" w:eastAsia="Times New Roman" w:hAnsi="Times New Roman" w:cs="Times New Roman"/>
+          <w:b/>
+          <w:sz w:val="28"/>
+          <w:szCs w:val="28"/>
+          <w:lang w:val="en-US" w:bidi="ar-SA"/>
+        </w:rPr>
+        <w:t>5</w:t>
+      </w:r>
+      <w:r>
+        <w:rPr>
+          <w:rFonts w:ascii="Times New Roman" w:eastAsia="Times New Roman" w:hAnsi="Times New Roman" w:cs="Times New Roman"/>
+          <w:b/>
+          <w:sz w:val="28"/>
+          <w:szCs w:val="28"/>
+          <w:lang w:val="en-US" w:bidi="ar-SA"/>
+        </w:rPr>
+        <w:t>)</w:t>
       </w:r>
     </w:p>
     <w:p>
@@ -1851,7 +2428,37 @@
           <w:szCs w:val="28"/>
           <w:lang w:val="en-US" w:bidi="ar-SA"/>
         </w:rPr>
-        <w:t xml:space="preserve">                                                                                                      5</w:t>
+        <w:t xml:space="preserve">                                                                                                   </w:t>
+      </w:r>
+      <w:r>
+        <w:rPr>
+          <w:rFonts w:ascii="Times New Roman" w:eastAsia="Times New Roman" w:hAnsi="Times New Roman" w:cs="Times New Roman"/>
+          <w:b/>
+          <w:sz w:val="28"/>
+          <w:szCs w:val="28"/>
+          <w:lang w:val="en-US" w:bidi="ar-SA"/>
+        </w:rPr>
+        <w:t>(</w:t>
+      </w:r>
+      <w:r>
+        <w:rPr>
+          <w:rFonts w:ascii="Times New Roman" w:eastAsia="Times New Roman" w:hAnsi="Times New Roman" w:cs="Times New Roman"/>
+          <w:b/>
+          <w:sz w:val="28"/>
+          <w:szCs w:val="28"/>
+          <w:lang w:val="en-US" w:bidi="ar-SA"/>
+        </w:rPr>
+        <w:t>5</w:t>
+      </w:r>
+      <w:r>
+        <w:rPr>
+          <w:rFonts w:ascii="Times New Roman" w:eastAsia="Times New Roman" w:hAnsi="Times New Roman" w:cs="Times New Roman"/>
+          <w:b/>
+          <w:sz w:val="28"/>
+          <w:szCs w:val="28"/>
+          <w:lang w:val="en-US" w:bidi="ar-SA"/>
+        </w:rPr>
+        <w:t>)</w:t>
       </w:r>
     </w:p>
     <w:p>
@@ -1896,28 +2503,45 @@
           <w:szCs w:val="28"/>
           <w:lang w:val="en-US" w:bidi="ar-SA"/>
         </w:rPr>
-        <w:t xml:space="preserve">     ( 5×1=5)</w:t>
-      </w:r>
-    </w:p>
-    <w:p>
-      <w:pPr>
-        <w:spacing w:after="0" w:line="240" w:lineRule="auto"/>
-        <w:jc w:val="both"/>
-        <w:rPr>
-          <w:rFonts w:ascii="Times New Roman" w:eastAsia="Times New Roman" w:hAnsi="Times New Roman" w:cs="Times New Roman"/>
-          <w:sz w:val="28"/>
-          <w:szCs w:val="28"/>
-          <w:lang w:val="en-US" w:bidi="ar-SA"/>
-        </w:rPr>
-      </w:pPr>
-      <w:r>
-        <w:rPr>
-          <w:rFonts w:ascii="Times New Roman" w:eastAsia="Times New Roman" w:hAnsi="Times New Roman" w:cs="Times New Roman"/>
-          <w:sz w:val="28"/>
-          <w:szCs w:val="28"/>
-          <w:lang w:val="en-US" w:bidi="ar-SA"/>
-        </w:rPr>
-        <w:t>a. She .........her room yesterday. ( clean, cleaned)</w:t>
+        <w:t xml:space="preserve">     (5×1=5)</w:t>
+      </w:r>
+    </w:p>
+    <w:p>
+      <w:pPr>
+        <w:spacing w:after="0" w:line="240" w:lineRule="auto"/>
+        <w:rPr>
+          <w:rFonts w:ascii="Times New Roman" w:eastAsia="Times New Roman" w:hAnsi="Times New Roman" w:cs="Times New Roman"/>
+          <w:sz w:val="28"/>
+          <w:szCs w:val="28"/>
+          <w:lang w:val="en-US" w:bidi="ar-SA"/>
+        </w:rPr>
+      </w:pPr>
+      <w:r>
+        <w:rPr>
+          <w:rFonts w:ascii="Times New Roman" w:eastAsia="Times New Roman" w:hAnsi="Times New Roman" w:cs="Times New Roman"/>
+          <w:sz w:val="28"/>
+          <w:szCs w:val="28"/>
+          <w:lang w:val="en-US" w:bidi="ar-SA"/>
+        </w:rPr>
+        <w:t>a. She .........her room yesterday. (clean,</w:t>
+      </w:r>
+      <w:r>
+        <w:rPr>
+          <w:rFonts w:ascii="Times New Roman" w:eastAsia="Times New Roman" w:hAnsi="Times New Roman" w:cs="Times New Roman"/>
+          <w:sz w:val="28"/>
+          <w:szCs w:val="28"/>
+          <w:lang w:val="en-US" w:bidi="ar-SA"/>
+        </w:rPr>
+        <w:t xml:space="preserve"> </w:t>
+      </w:r>
+      <w:r>
+        <w:rPr>
+          <w:rFonts w:ascii="Times New Roman" w:eastAsia="Times New Roman" w:hAnsi="Times New Roman" w:cs="Times New Roman"/>
+          <w:sz w:val="28"/>
+          <w:szCs w:val="28"/>
+          <w:lang w:val="en-US" w:bidi="ar-SA"/>
+        </w:rPr>
+        <w:t>cleaned)</w:t>
       </w:r>
       <w:r>
         <w:rPr>
@@ -1927,28 +2551,63 @@
           <w:lang w:val="en-US" w:bidi="ar-SA"/>
         </w:rPr>
         <w:br/>
-        <w:t>b. Yesterday at six, I ........ dinner.( am preparing, was preparing)</w:t>
-      </w:r>
-    </w:p>
-    <w:p>
-      <w:pPr>
-        <w:spacing w:after="0" w:line="240" w:lineRule="auto"/>
-        <w:jc w:val="both"/>
-        <w:rPr>
-          <w:rFonts w:ascii="Times New Roman" w:eastAsia="Times New Roman" w:hAnsi="Times New Roman" w:cs="Times New Roman"/>
-          <w:sz w:val="28"/>
-          <w:szCs w:val="28"/>
-          <w:lang w:val="en-US" w:bidi="ar-SA"/>
-        </w:rPr>
-      </w:pPr>
-      <w:r>
-        <w:rPr>
-          <w:rFonts w:ascii="Times New Roman" w:eastAsia="Times New Roman" w:hAnsi="Times New Roman" w:cs="Times New Roman"/>
-          <w:sz w:val="28"/>
-          <w:szCs w:val="28"/>
-          <w:lang w:val="en-US" w:bidi="ar-SA"/>
-        </w:rPr>
-        <w:t>c.The firefighter climbed......the ladder to save the girl. ( up, down)</w:t>
+        <w:t>b. Yesterday at six, I ........ dinner.</w:t>
+      </w:r>
+      <w:r>
+        <w:rPr>
+          <w:rFonts w:ascii="Times New Roman" w:eastAsia="Times New Roman" w:hAnsi="Times New Roman" w:cs="Times New Roman"/>
+          <w:sz w:val="28"/>
+          <w:szCs w:val="28"/>
+          <w:lang w:val="en-US" w:bidi="ar-SA"/>
+        </w:rPr>
+        <w:t xml:space="preserve"> </w:t>
+      </w:r>
+      <w:r>
+        <w:rPr>
+          <w:rFonts w:ascii="Times New Roman" w:eastAsia="Times New Roman" w:hAnsi="Times New Roman" w:cs="Times New Roman"/>
+          <w:sz w:val="28"/>
+          <w:szCs w:val="28"/>
+          <w:lang w:val="en-US" w:bidi="ar-SA"/>
+        </w:rPr>
+        <w:t>(am preparing, was preparing)</w:t>
+      </w:r>
+    </w:p>
+    <w:p>
+      <w:pPr>
+        <w:spacing w:after="0" w:line="240" w:lineRule="auto"/>
+        <w:rPr>
+          <w:rFonts w:ascii="Times New Roman" w:eastAsia="Times New Roman" w:hAnsi="Times New Roman" w:cs="Times New Roman"/>
+          <w:sz w:val="28"/>
+          <w:szCs w:val="28"/>
+          <w:lang w:val="en-US" w:bidi="ar-SA"/>
+        </w:rPr>
+      </w:pPr>
+      <w:r>
+        <w:rPr>
+          <w:rFonts w:ascii="Times New Roman" w:eastAsia="Times New Roman" w:hAnsi="Times New Roman" w:cs="Times New Roman"/>
+          <w:sz w:val="28"/>
+          <w:szCs w:val="28"/>
+          <w:lang w:val="en-US" w:bidi="ar-SA"/>
+        </w:rPr>
+        <w:t>c.</w:t>
+      </w:r>
+      <w:r>
+        <w:rPr>
+          <w:rFonts w:ascii="Times New Roman" w:eastAsia="Times New Roman" w:hAnsi="Times New Roman" w:cs="Times New Roman"/>
+          <w:sz w:val="28"/>
+          <w:szCs w:val="28"/>
+          <w:lang w:val="en-US" w:bidi="ar-SA"/>
+        </w:rPr>
+        <w:t xml:space="preserve"> </w:t>
+      </w:r>
+      <w:r>
+        <w:rPr>
+          <w:rFonts w:ascii="Times New Roman" w:eastAsia="Times New Roman" w:hAnsi="Times New Roman" w:cs="Times New Roman"/>
+          <w:sz w:val="28"/>
+          <w:szCs w:val="28"/>
+          <w:lang w:val="en-US" w:bidi="ar-SA"/>
+        </w:rPr>
+        <w:t>The firefighter climbed......the ladder to save the girl. (up, down)</w:t>
       </w:r>
       <w:r>
         <w:rPr>
@@ -1958,28 +2617,101 @@
           <w:lang w:val="en-US" w:bidi="ar-SA"/>
         </w:rPr>
         <w:br/>
-        <w:t>d.Gita often.......TV. ( watch, watches)</w:t>
-      </w:r>
-    </w:p>
-    <w:p>
-      <w:pPr>
-        <w:spacing w:after="0" w:line="240" w:lineRule="auto"/>
-        <w:jc w:val="both"/>
-        <w:rPr>
-          <w:rFonts w:ascii="Times New Roman" w:eastAsia="Times New Roman" w:hAnsi="Times New Roman" w:cs="Times New Roman"/>
-          <w:sz w:val="28"/>
-          <w:szCs w:val="28"/>
-          <w:lang w:val="en-US" w:bidi="ar-SA"/>
-        </w:rPr>
-      </w:pPr>
-      <w:r>
-        <w:rPr>
-          <w:rFonts w:ascii="Times New Roman" w:eastAsia="Times New Roman" w:hAnsi="Times New Roman" w:cs="Times New Roman"/>
-          <w:sz w:val="28"/>
-          <w:szCs w:val="28"/>
-          <w:lang w:val="en-US" w:bidi="ar-SA"/>
-        </w:rPr>
-        <w:t>e.I am very fat..... I'm happy. (but,and)</w:t>
+        <w:t>d.</w:t>
+      </w:r>
+      <w:r>
+        <w:rPr>
+          <w:rFonts w:ascii="Times New Roman" w:eastAsia="Times New Roman" w:hAnsi="Times New Roman" w:cs="Times New Roman"/>
+          <w:sz w:val="28"/>
+          <w:szCs w:val="28"/>
+          <w:lang w:val="en-US" w:bidi="ar-SA"/>
+        </w:rPr>
+        <w:t xml:space="preserve"> </w:t>
+      </w:r>
+      <w:r>
+        <w:rPr>
+          <w:rFonts w:ascii="Times New Roman" w:eastAsia="Times New Roman" w:hAnsi="Times New Roman" w:cs="Times New Roman"/>
+          <w:sz w:val="28"/>
+          <w:szCs w:val="28"/>
+          <w:lang w:val="en-US" w:bidi="ar-SA"/>
+        </w:rPr>
+        <w:t>Gita often.......TV. (watch, watches)</w:t>
+      </w:r>
+    </w:p>
+    <w:p>
+      <w:pPr>
+        <w:spacing w:after="0" w:line="240" w:lineRule="auto"/>
+        <w:rPr>
+          <w:rFonts w:ascii="Times New Roman" w:eastAsia="Times New Roman" w:hAnsi="Times New Roman" w:cs="Times New Roman"/>
+          <w:sz w:val="28"/>
+          <w:szCs w:val="28"/>
+          <w:lang w:val="en-US" w:bidi="ar-SA"/>
+        </w:rPr>
+      </w:pPr>
+      <w:r>
+        <w:rPr>
+          <w:rFonts w:ascii="Times New Roman" w:eastAsia="Times New Roman" w:hAnsi="Times New Roman" w:cs="Times New Roman"/>
+          <w:sz w:val="28"/>
+          <w:szCs w:val="28"/>
+          <w:lang w:val="en-US" w:bidi="ar-SA"/>
+        </w:rPr>
+        <w:t>e.</w:t>
+      </w:r>
+      <w:r>
+        <w:rPr>
+          <w:rFonts w:ascii="Times New Roman" w:eastAsia="Times New Roman" w:hAnsi="Times New Roman" w:cs="Times New Roman"/>
+          <w:sz w:val="28"/>
+          <w:szCs w:val="28"/>
+          <w:lang w:val="en-US" w:bidi="ar-SA"/>
+        </w:rPr>
+        <w:t xml:space="preserve"> </w:t>
+      </w:r>
+      <w:r>
+        <w:rPr>
+          <w:rFonts w:ascii="Times New Roman" w:eastAsia="Times New Roman" w:hAnsi="Times New Roman" w:cs="Times New Roman"/>
+          <w:sz w:val="28"/>
+          <w:szCs w:val="28"/>
+          <w:lang w:val="en-US" w:bidi="ar-SA"/>
+        </w:rPr>
+        <w:t>I am very fat</w:t>
+      </w:r>
+      <w:proofErr w:type="gramStart"/>
+      <w:r>
+        <w:rPr>
+          <w:rFonts w:ascii="Times New Roman" w:eastAsia="Times New Roman" w:hAnsi="Times New Roman" w:cs="Times New Roman"/>
+          <w:sz w:val="28"/>
+          <w:szCs w:val="28"/>
+          <w:lang w:val="en-US" w:bidi="ar-SA"/>
+        </w:rPr>
+        <w:t>.....</w:t>
+      </w:r>
+      <w:proofErr w:type="gramEnd"/>
+      <w:r>
+        <w:rPr>
+          <w:rFonts w:ascii="Times New Roman" w:eastAsia="Times New Roman" w:hAnsi="Times New Roman" w:cs="Times New Roman"/>
+          <w:sz w:val="28"/>
+          <w:szCs w:val="28"/>
+          <w:lang w:val="en-US" w:bidi="ar-SA"/>
+        </w:rPr>
+        <w:t xml:space="preserve"> I'm happy. (but,</w:t>
+      </w:r>
+      <w:r>
+        <w:rPr>
+          <w:rFonts w:ascii="Times New Roman" w:eastAsia="Times New Roman" w:hAnsi="Times New Roman" w:cs="Times New Roman"/>
+          <w:sz w:val="28"/>
+          <w:szCs w:val="28"/>
+          <w:lang w:val="en-US" w:bidi="ar-SA"/>
+        </w:rPr>
+        <w:t xml:space="preserve"> </w:t>
+      </w:r>
+      <w:r>
+        <w:rPr>
+          <w:rFonts w:ascii="Times New Roman" w:eastAsia="Times New Roman" w:hAnsi="Times New Roman" w:cs="Times New Roman"/>
+          <w:sz w:val="28"/>
+          <w:szCs w:val="28"/>
+          <w:lang w:val="en-US" w:bidi="ar-SA"/>
+        </w:rPr>
+        <w:t>and)</w:t>
       </w:r>
     </w:p>
     <w:p>
@@ -2003,8 +2735,11 @@
     <w:p>
       <w:pPr>
         <w:spacing w:after="0"/>
+        <w:jc w:val="center"/>
         <w:rPr>
           <w:rFonts w:ascii="Times New Roman" w:hAnsi="Times New Roman" w:cs="Times New Roman"/>
+          <w:b/>
+          <w:bCs/>
           <w:sz w:val="28"/>
           <w:szCs w:val="28"/>
         </w:rPr>
@@ -2012,14 +2747,8 @@
       <w:r>
         <w:rPr>
           <w:rFonts w:ascii="Times New Roman" w:hAnsi="Times New Roman" w:cs="Times New Roman"/>
-          <w:sz w:val="28"/>
-          <w:szCs w:val="28"/>
-        </w:rPr>
-        <w:t xml:space="preserve">                                         </w:t>
-      </w:r>
-      <w:r>
-        <w:rPr>
-          <w:rFonts w:ascii="Times New Roman" w:hAnsi="Times New Roman" w:cs="Times New Roman"/>
+          <w:b/>
+          <w:bCs/>
           <w:sz w:val="28"/>
           <w:szCs w:val="28"/>
         </w:rPr>
@@ -2043,7 +2772,7 @@
 </file>
 
 <file path=word/styles.xml><?xml version="1.0" encoding="utf-8"?>
-<w:styles xmlns:mc="http://schemas.openxmlformats.org/markup-compatibility/2006" xmlns:r="http://schemas.openxmlformats.org/officeDocument/2006/relationships" xmlns:w="http://schemas.openxmlformats.org/wordprocessingml/2006/main" xmlns:w14="http://schemas.microsoft.com/office/word/2010/wordml" xmlns:w15="http://schemas.microsoft.com/office/word/2012/wordml" xmlns:w16se="http://schemas.microsoft.com/office/word/2015/wordml/symex" mc:Ignorable="w14 w15 w16se">
+<w:styles xmlns:mc="http://schemas.openxmlformats.org/markup-compatibility/2006" xmlns:r="http://schemas.openxmlformats.org/officeDocument/2006/relationships" xmlns:w="http://schemas.openxmlformats.org/wordprocessingml/2006/main" xmlns:w14="http://schemas.microsoft.com/office/word/2010/wordml" xmlns:w15="http://schemas.microsoft.com/office/word/2012/wordml" xmlns:w16cex="http://schemas.microsoft.com/office/word/2018/wordml/cex" xmlns:w16cid="http://schemas.microsoft.com/office/word/2016/wordml/cid" xmlns:w16="http://schemas.microsoft.com/office/word/2018/wordml" xmlns:w16du="http://schemas.microsoft.com/office/word/2023/wordml/word16du" xmlns:w16sdtdh="http://schemas.microsoft.com/office/word/2020/wordml/sdtdatahash" xmlns:w16sdtfl="http://schemas.microsoft.com/office/word/2024/wordml/sdtformatlock" xmlns:w16se="http://schemas.microsoft.com/office/word/2015/wordml/symex" mc:Ignorable="w14 w15 w16se w16cid w16 w16cex w16sdtdh w16sdtfl w16du">
   <w:docDefaults>
     <w:rPrDefault>
       <w:rPr>
@@ -2058,7 +2787,7 @@
       </w:pPr>
     </w:pPrDefault>
   </w:docDefaults>
-  <w:latentStyles w:defLockedState="0" w:defUIPriority="99" w:defSemiHidden="0" w:defUnhideWhenUsed="0" w:defQFormat="0" w:count="371">
+  <w:latentStyles w:defLockedState="0" w:defUIPriority="99" w:defSemiHidden="0" w:defUnhideWhenUsed="0" w:defQFormat="0" w:count="376">
     <w:lsdException w:name="Normal" w:uiPriority="0" w:qFormat="1"/>
     <w:lsdException w:name="heading 1" w:uiPriority="9" w:qFormat="1"/>
     <w:lsdException w:name="heading 2" w:semiHidden="1" w:uiPriority="9" w:unhideWhenUsed="1" w:qFormat="1"/>
@@ -2430,6 +3159,11 @@
     <w:lsdException w:name="List Table 5 Dark Accent 6" w:uiPriority="50"/>
     <w:lsdException w:name="List Table 6 Colorful Accent 6" w:uiPriority="51"/>
     <w:lsdException w:name="List Table 7 Colorful Accent 6" w:uiPriority="52"/>
+    <w:lsdException w:name="Mention" w:semiHidden="1" w:unhideWhenUsed="1"/>
+    <w:lsdException w:name="Smart Hyperlink" w:semiHidden="1" w:unhideWhenUsed="1"/>
+    <w:lsdException w:name="Hashtag" w:semiHidden="1" w:unhideWhenUsed="1"/>
+    <w:lsdException w:name="Unresolved Mention" w:semiHidden="1" w:unhideWhenUsed="1"/>
+    <w:lsdException w:name="Smart Link" w:semiHidden="1" w:unhideWhenUsed="1"/>
   </w:latentStyles>
   <w:style w:type="paragraph" w:default="1" w:styleId="Normal">
     <w:name w:val="Normal"/>
@@ -2469,6 +3203,17 @@
     <w:uiPriority w:val="99"/>
     <w:semiHidden/>
     <w:unhideWhenUsed/>
+  </w:style>
+  <w:style w:type="paragraph" w:styleId="ListParagraph">
+    <w:name w:val="List Paragraph"/>
+    <w:basedOn w:val="Normal"/>
+    <w:uiPriority w:val="34"/>
+    <w:qFormat/>
+    <w:rsid w:val="00267C39"/>
+    <w:pPr>
+      <w:ind w:left="720"/>
+      <w:contextualSpacing/>
+    </w:pPr>
   </w:style>
 </w:styles>
 </file>

</xml_diff>

<commit_message>
Fix typos and formatting in various documents
</commit_message>
<xml_diff>
--- a/Received/five/5 English.docx
+++ b/Received/five/5 English.docx
@@ -1293,47 +1293,7 @@
           <w:szCs w:val="28"/>
           <w:lang w:val="en-US" w:bidi="ar-SA"/>
         </w:rPr>
-        <w:t xml:space="preserve">Hannah Montana is a famous actress. She is from United States of America and she loves travelling. Hannah is planning to travel to Cuzco in Peru, she's going to travel next Friday and she's going to stay in Peru for three weeks. She's going to visit Sacsayhuaman and then Machu Picchu. She likes Peruvian culture, and she's going to eat a delicious Cuzco traditional food. Hannah has friends in Lima; </w:t>
-      </w:r>
-      <w:proofErr w:type="gramStart"/>
-      <w:r>
-        <w:rPr>
-          <w:rFonts w:ascii="Times New Roman" w:eastAsia="Times New Roman" w:hAnsi="Times New Roman" w:cs="Times New Roman"/>
-          <w:sz w:val="28"/>
-          <w:szCs w:val="28"/>
-          <w:lang w:val="en-US" w:bidi="ar-SA"/>
-        </w:rPr>
-        <w:t>so</w:t>
-      </w:r>
-      <w:proofErr w:type="gramEnd"/>
-      <w:r>
-        <w:rPr>
-          <w:rFonts w:ascii="Times New Roman" w:eastAsia="Times New Roman" w:hAnsi="Times New Roman" w:cs="Times New Roman"/>
-          <w:sz w:val="28"/>
-          <w:szCs w:val="28"/>
-          <w:lang w:val="en-US" w:bidi="ar-SA"/>
-        </w:rPr>
-        <w:t xml:space="preserve"> after Cuzco, she's going to go there and she is going to visit her friends, too. They live in San Luis and they are going to prepare a big welcome party for </w:t>
-      </w:r>
-      <w:proofErr w:type="gramStart"/>
-      <w:r>
-        <w:rPr>
-          <w:rFonts w:ascii="Times New Roman" w:eastAsia="Times New Roman" w:hAnsi="Times New Roman" w:cs="Times New Roman"/>
-          <w:sz w:val="28"/>
-          <w:szCs w:val="28"/>
-          <w:lang w:val="en-US" w:bidi="ar-SA"/>
-        </w:rPr>
-        <w:t>Hannah,</w:t>
-      </w:r>
-      <w:proofErr w:type="gramEnd"/>
-      <w:r>
-        <w:rPr>
-          <w:rFonts w:ascii="Times New Roman" w:eastAsia="Times New Roman" w:hAnsi="Times New Roman" w:cs="Times New Roman"/>
-          <w:sz w:val="28"/>
-          <w:szCs w:val="28"/>
-          <w:lang w:val="en-US" w:bidi="ar-SA"/>
-        </w:rPr>
-        <w:t xml:space="preserve"> they love her a lot and they are going to buy a lot of presents for her. After one week, she's going to travel to Arequipa, she is going to take a lot of pictures and she's going to buy some souvenirs and take them back to United States.</w:t>
+        <w:t>Hannah Montana is a famous actress. She is from United States of America and she loves travelling. Hannah is planning to travel to Cuzco in Peru, she's going to travel next Friday and she's going to stay in Peru for three weeks. She's going to visit Sacsayhuaman and then Machu Picchu. She likes Peruvian culture, and she's going to eat a delicious Cuzco traditional food. Hannah has friends in Lima; so after Cuzco, she's going to go there and she is going to visit her friends, too. They live in San Luis and they are going to prepare a big welcome party for Hannah, they love her a lot and they are going to buy a lot of presents for her. After one week, she's going to travel to Arequipa, she is going to take a lot of pictures and she's going to buy some souvenirs and take them back to United States.</w:t>
       </w:r>
     </w:p>
     <w:p>
@@ -1719,29 +1679,7 @@
           <w:szCs w:val="28"/>
           <w:lang w:val="en-US" w:bidi="ar-SA"/>
         </w:rPr>
-        <w:t xml:space="preserve">                          </w:t>
-      </w:r>
-      <w:proofErr w:type="gramStart"/>
-      <w:r>
-        <w:rPr>
-          <w:rFonts w:ascii="Times New Roman" w:eastAsia="Times New Roman" w:hAnsi="Times New Roman" w:cs="Times New Roman"/>
-          <w:b/>
-          <w:sz w:val="28"/>
-          <w:szCs w:val="28"/>
-          <w:lang w:val="en-US" w:bidi="ar-SA"/>
-        </w:rPr>
-        <w:t xml:space="preserve">   (</w:t>
-      </w:r>
-      <w:proofErr w:type="gramEnd"/>
-      <w:r>
-        <w:rPr>
-          <w:rFonts w:ascii="Times New Roman" w:eastAsia="Times New Roman" w:hAnsi="Times New Roman" w:cs="Times New Roman"/>
-          <w:b/>
-          <w:sz w:val="28"/>
-          <w:szCs w:val="28"/>
-          <w:lang w:val="en-US" w:bidi="ar-SA"/>
-        </w:rPr>
-        <w:t>5×2=10)</w:t>
+        <w:t xml:space="preserve">                             (5×2=10)</w:t>
       </w:r>
     </w:p>
     <w:p>
@@ -2378,57 +2316,55 @@
     <w:p>
       <w:pPr>
         <w:spacing w:after="0" w:line="240" w:lineRule="auto"/>
-        <w:jc w:val="both"/>
-        <w:rPr>
-          <w:rFonts w:ascii="Times New Roman" w:eastAsia="Times New Roman" w:hAnsi="Times New Roman" w:cs="Times New Roman"/>
-          <w:b/>
-          <w:sz w:val="28"/>
-          <w:szCs w:val="28"/>
-          <w:lang w:val="en-US" w:bidi="ar-SA"/>
-        </w:rPr>
-      </w:pPr>
-      <w:r>
-        <w:rPr>
-          <w:rFonts w:ascii="Times New Roman" w:eastAsia="Times New Roman" w:hAnsi="Times New Roman" w:cs="Times New Roman"/>
-          <w:b/>
-          <w:sz w:val="28"/>
-          <w:szCs w:val="28"/>
-          <w:lang w:val="en-US" w:bidi="ar-SA"/>
-        </w:rPr>
-        <w:t>8.Write a sick leave application to the principal of your school.</w:t>
-      </w:r>
-      <w:r>
-        <w:rPr>
-          <w:rFonts w:ascii="Times New Roman" w:eastAsia="Times New Roman" w:hAnsi="Times New Roman" w:cs="Times New Roman"/>
-          <w:b/>
-          <w:sz w:val="28"/>
-          <w:szCs w:val="28"/>
-          <w:lang w:val="en-US" w:bidi="ar-SA"/>
-        </w:rPr>
-        <w:t xml:space="preserve">                         </w:t>
-      </w:r>
-    </w:p>
-    <w:p>
-      <w:pPr>
-        <w:spacing w:after="0" w:line="240" w:lineRule="auto"/>
-        <w:jc w:val="both"/>
-        <w:rPr>
-          <w:rFonts w:ascii="Times New Roman" w:eastAsia="Times New Roman" w:hAnsi="Times New Roman" w:cs="Times New Roman"/>
-          <w:b/>
-          <w:sz w:val="28"/>
-          <w:szCs w:val="28"/>
-          <w:lang w:val="en-US" w:bidi="ar-SA"/>
-        </w:rPr>
-      </w:pPr>
-      <w:r>
-        <w:rPr>
-          <w:rFonts w:ascii="Times New Roman" w:eastAsia="Times New Roman" w:hAnsi="Times New Roman" w:cs="Times New Roman"/>
-          <w:b/>
-          <w:sz w:val="28"/>
-          <w:szCs w:val="28"/>
-          <w:lang w:val="en-US" w:bidi="ar-SA"/>
-        </w:rPr>
-        <w:t xml:space="preserve">                                                                                                   </w:t>
+        <w:ind w:left="360" w:hanging="360"/>
+        <w:jc w:val="both"/>
+        <w:rPr>
+          <w:rFonts w:ascii="Times New Roman" w:eastAsia="Times New Roman" w:hAnsi="Times New Roman" w:cs="Times New Roman"/>
+          <w:b/>
+          <w:sz w:val="28"/>
+          <w:szCs w:val="28"/>
+          <w:lang w:val="en-US" w:bidi="ar-SA"/>
+        </w:rPr>
+      </w:pPr>
+      <w:r>
+        <w:rPr>
+          <w:rFonts w:ascii="Times New Roman" w:eastAsia="Times New Roman" w:hAnsi="Times New Roman" w:cs="Times New Roman"/>
+          <w:b/>
+          <w:sz w:val="28"/>
+          <w:szCs w:val="28"/>
+          <w:lang w:val="en-US" w:bidi="ar-SA"/>
+        </w:rPr>
+        <w:t>8.</w:t>
+      </w:r>
+      <w:r>
+        <w:rPr>
+          <w:rFonts w:ascii="Times New Roman" w:eastAsia="Times New Roman" w:hAnsi="Times New Roman" w:cs="Times New Roman"/>
+          <w:b/>
+          <w:sz w:val="28"/>
+          <w:szCs w:val="28"/>
+          <w:lang w:val="en-US" w:bidi="ar-SA"/>
+        </w:rPr>
+        <w:t xml:space="preserve"> </w:t>
+      </w:r>
+      <w:r>
+        <w:rPr>
+          <w:rFonts w:ascii="Times New Roman" w:eastAsia="Times New Roman" w:hAnsi="Times New Roman" w:cs="Times New Roman"/>
+          <w:b/>
+          <w:sz w:val="28"/>
+          <w:szCs w:val="28"/>
+          <w:lang w:val="en-US" w:bidi="ar-SA"/>
+        </w:rPr>
+        <w:t>Write a sick leave application to the principal of your school.</w:t>
+      </w:r>
+      <w:r>
+        <w:rPr>
+          <w:rFonts w:ascii="Times New Roman" w:eastAsia="Times New Roman" w:hAnsi="Times New Roman" w:cs="Times New Roman"/>
+          <w:b/>
+          <w:sz w:val="28"/>
+          <w:szCs w:val="28"/>
+          <w:lang w:val="en-US" w:bidi="ar-SA"/>
+        </w:rPr>
+        <w:t xml:space="preserve">                                                                                        </w:t>
       </w:r>
       <w:r>
         <w:rPr>
@@ -2673,27 +2609,7 @@
           <w:szCs w:val="28"/>
           <w:lang w:val="en-US" w:bidi="ar-SA"/>
         </w:rPr>
-        <w:t>I am very fat</w:t>
-      </w:r>
-      <w:proofErr w:type="gramStart"/>
-      <w:r>
-        <w:rPr>
-          <w:rFonts w:ascii="Times New Roman" w:eastAsia="Times New Roman" w:hAnsi="Times New Roman" w:cs="Times New Roman"/>
-          <w:sz w:val="28"/>
-          <w:szCs w:val="28"/>
-          <w:lang w:val="en-US" w:bidi="ar-SA"/>
-        </w:rPr>
-        <w:t>.....</w:t>
-      </w:r>
-      <w:proofErr w:type="gramEnd"/>
-      <w:r>
-        <w:rPr>
-          <w:rFonts w:ascii="Times New Roman" w:eastAsia="Times New Roman" w:hAnsi="Times New Roman" w:cs="Times New Roman"/>
-          <w:sz w:val="28"/>
-          <w:szCs w:val="28"/>
-          <w:lang w:val="en-US" w:bidi="ar-SA"/>
-        </w:rPr>
-        <w:t xml:space="preserve"> I'm happy. (but,</w:t>
+        <w:t>I am very fat..... I'm happy. (but,</w:t>
       </w:r>
       <w:r>
         <w:rPr>

</xml_diff>

<commit_message>
Updated English documents with additional questions and corrections.
</commit_message>
<xml_diff>
--- a/Received/five/5 English.docx
+++ b/Received/five/5 English.docx
@@ -232,27 +232,7 @@
           <w:bCs/>
           <w:sz w:val="20"/>
         </w:rPr>
-        <w:t xml:space="preserve">Ratnanagar-7, </w:t>
-      </w:r>
-      <w:proofErr w:type="spellStart"/>
-      <w:r>
-        <w:rPr>
-          <w:rFonts w:ascii="Times New Roman" w:hAnsi="Times New Roman"/>
-          <w:b/>
-          <w:bCs/>
-          <w:sz w:val="20"/>
-        </w:rPr>
-        <w:t>Sauraha</w:t>
-      </w:r>
-      <w:proofErr w:type="spellEnd"/>
-      <w:r>
-        <w:rPr>
-          <w:rFonts w:ascii="Times New Roman" w:hAnsi="Times New Roman"/>
-          <w:b/>
-          <w:bCs/>
-          <w:sz w:val="20"/>
-        </w:rPr>
-        <w:t>, Chitwan</w:t>
+        <w:t>Ratnanagar-7, Sauraha, Chitwan</w:t>
       </w:r>
     </w:p>
     <w:p>
@@ -669,102 +649,258 @@
           <w:szCs w:val="28"/>
           <w:lang w:val="en-US" w:bidi="ar-SA"/>
         </w:rPr>
-        <w:t xml:space="preserve">n is a Nepalese teacher, social entrepreneur, innovator and social activist. He is the initiator of the Nepal Wireless Networking Project. He works for income-generation initiatives to villagers and fund schools. He has built community-run schools that improve the quality of education, bring job opportunities to villages, and decrease migration to urban </w:t>
-      </w:r>
-      <w:proofErr w:type="spellStart"/>
-      <w:r>
-        <w:rPr>
-          <w:rFonts w:ascii="Times New Roman" w:eastAsia="Times New Roman" w:hAnsi="Times New Roman" w:cs="Times New Roman"/>
-          <w:sz w:val="28"/>
-          <w:szCs w:val="28"/>
-          <w:lang w:val="en-US" w:bidi="ar-SA"/>
-        </w:rPr>
-        <w:t>centres</w:t>
-      </w:r>
-      <w:proofErr w:type="spellEnd"/>
-      <w:r>
-        <w:rPr>
-          <w:rFonts w:ascii="Times New Roman" w:eastAsia="Times New Roman" w:hAnsi="Times New Roman" w:cs="Times New Roman"/>
-          <w:sz w:val="28"/>
-          <w:szCs w:val="28"/>
-          <w:lang w:val="en-US" w:bidi="ar-SA"/>
-        </w:rPr>
-        <w:t>. His work is inspiring many youths to serve the country. He is the founder of a nonprofit organization named "</w:t>
-      </w:r>
-      <w:proofErr w:type="spellStart"/>
-      <w:r>
-        <w:rPr>
-          <w:rFonts w:ascii="Times New Roman" w:eastAsia="Times New Roman" w:hAnsi="Times New Roman" w:cs="Times New Roman"/>
-          <w:sz w:val="28"/>
-          <w:szCs w:val="28"/>
-          <w:lang w:val="en-US" w:bidi="ar-SA"/>
-        </w:rPr>
-        <w:t>Rashtriya</w:t>
-      </w:r>
-      <w:proofErr w:type="spellEnd"/>
-      <w:r>
-        <w:rPr>
-          <w:rFonts w:ascii="Times New Roman" w:eastAsia="Times New Roman" w:hAnsi="Times New Roman" w:cs="Times New Roman"/>
+        <w:t>n is a Nepalese teacher, social entrepreneur, innovator and social activist. He is the initiator of the Nepal Wireless Networking Project. He works for income-generation initiatives to villagers and fund schools. He has built community-run schools that improve the quality of education, bring job opportunities to villages, and decrease migration to urban centres. His work is inspiring many youths to serve the country. He is the founder of a nonprofit organization named "Rashtriya Abiskar Kendra" (National Innovation Centre) established in 2012. He is running a crowd funding campaign to fund National Innovation efforts.</w:t>
+      </w:r>
+    </w:p>
+    <w:p>
+      <w:pPr>
+        <w:spacing w:after="0" w:line="240" w:lineRule="auto"/>
+        <w:jc w:val="both"/>
+        <w:rPr>
+          <w:rFonts w:ascii="Times New Roman" w:eastAsia="Times New Roman" w:hAnsi="Times New Roman" w:cs="Times New Roman"/>
+          <w:sz w:val="28"/>
+          <w:szCs w:val="28"/>
+          <w:lang w:val="en-US" w:bidi="ar-SA"/>
+        </w:rPr>
+      </w:pPr>
+    </w:p>
+    <w:p>
+      <w:pPr>
+        <w:spacing w:after="0" w:line="240" w:lineRule="auto"/>
+        <w:jc w:val="both"/>
+        <w:rPr>
+          <w:rFonts w:ascii="Times New Roman" w:eastAsia="Times New Roman" w:hAnsi="Times New Roman" w:cs="Times New Roman"/>
+          <w:b/>
+          <w:sz w:val="28"/>
+          <w:szCs w:val="28"/>
+          <w:lang w:val="en-US" w:bidi="ar-SA"/>
+        </w:rPr>
+      </w:pPr>
+      <w:r>
+        <w:rPr>
+          <w:rFonts w:ascii="Times New Roman" w:eastAsia="Times New Roman" w:hAnsi="Times New Roman" w:cs="Times New Roman"/>
+          <w:b/>
+          <w:sz w:val="28"/>
+          <w:szCs w:val="28"/>
+          <w:lang w:val="en-US" w:bidi="ar-SA"/>
+        </w:rPr>
+        <w:t>A.</w:t>
+      </w:r>
+      <w:r>
+        <w:rPr>
+          <w:rFonts w:ascii="Times New Roman" w:eastAsia="Times New Roman" w:hAnsi="Times New Roman" w:cs="Times New Roman"/>
+          <w:b/>
           <w:sz w:val="28"/>
           <w:szCs w:val="28"/>
           <w:lang w:val="en-US" w:bidi="ar-SA"/>
         </w:rPr>
         <w:t xml:space="preserve"> </w:t>
       </w:r>
-      <w:proofErr w:type="spellStart"/>
-      <w:r>
-        <w:rPr>
-          <w:rFonts w:ascii="Times New Roman" w:eastAsia="Times New Roman" w:hAnsi="Times New Roman" w:cs="Times New Roman"/>
-          <w:sz w:val="28"/>
-          <w:szCs w:val="28"/>
-          <w:lang w:val="en-US" w:bidi="ar-SA"/>
-        </w:rPr>
-        <w:t>Abiskar</w:t>
-      </w:r>
-      <w:proofErr w:type="spellEnd"/>
-      <w:r>
-        <w:rPr>
-          <w:rFonts w:ascii="Times New Roman" w:eastAsia="Times New Roman" w:hAnsi="Times New Roman" w:cs="Times New Roman"/>
-          <w:sz w:val="28"/>
-          <w:szCs w:val="28"/>
-          <w:lang w:val="en-US" w:bidi="ar-SA"/>
-        </w:rPr>
-        <w:t xml:space="preserve"> Kendra" (National Innovation Centre) established in 2012. He is running a crowd funding campaign to fund National Innovation efforts.</w:t>
-      </w:r>
-    </w:p>
-    <w:p>
-      <w:pPr>
-        <w:spacing w:after="0" w:line="240" w:lineRule="auto"/>
-        <w:jc w:val="both"/>
-        <w:rPr>
-          <w:rFonts w:ascii="Times New Roman" w:eastAsia="Times New Roman" w:hAnsi="Times New Roman" w:cs="Times New Roman"/>
-          <w:sz w:val="28"/>
-          <w:szCs w:val="28"/>
-          <w:lang w:val="en-US" w:bidi="ar-SA"/>
-        </w:rPr>
-      </w:pPr>
-    </w:p>
-    <w:p>
-      <w:pPr>
-        <w:spacing w:after="0" w:line="240" w:lineRule="auto"/>
-        <w:jc w:val="both"/>
-        <w:rPr>
-          <w:rFonts w:ascii="Times New Roman" w:eastAsia="Times New Roman" w:hAnsi="Times New Roman" w:cs="Times New Roman"/>
-          <w:b/>
-          <w:sz w:val="28"/>
-          <w:szCs w:val="28"/>
-          <w:lang w:val="en-US" w:bidi="ar-SA"/>
-        </w:rPr>
-      </w:pPr>
-      <w:r>
-        <w:rPr>
-          <w:rFonts w:ascii="Times New Roman" w:eastAsia="Times New Roman" w:hAnsi="Times New Roman" w:cs="Times New Roman"/>
-          <w:b/>
-          <w:sz w:val="28"/>
-          <w:szCs w:val="28"/>
-          <w:lang w:val="en-US" w:bidi="ar-SA"/>
-        </w:rPr>
-        <w:t>A.</w:t>
+      <w:r>
+        <w:rPr>
+          <w:rFonts w:ascii="Times New Roman" w:eastAsia="Times New Roman" w:hAnsi="Times New Roman" w:cs="Times New Roman"/>
+          <w:b/>
+          <w:sz w:val="28"/>
+          <w:szCs w:val="28"/>
+          <w:lang w:val="en-US" w:bidi="ar-SA"/>
+        </w:rPr>
+        <w:t xml:space="preserve">Write True or False. </w:t>
+      </w:r>
+      <w:r>
+        <w:rPr>
+          <w:rFonts w:ascii="Times New Roman" w:eastAsia="Times New Roman" w:hAnsi="Times New Roman" w:cs="Times New Roman"/>
+          <w:b/>
+          <w:sz w:val="28"/>
+          <w:szCs w:val="28"/>
+          <w:lang w:val="en-US" w:bidi="ar-SA"/>
+        </w:rPr>
+        <w:t xml:space="preserve">                                                </w:t>
+      </w:r>
+      <w:r>
+        <w:rPr>
+          <w:rFonts w:ascii="Times New Roman" w:eastAsia="Times New Roman" w:hAnsi="Times New Roman" w:cs="Times New Roman"/>
+          <w:b/>
+          <w:sz w:val="28"/>
+          <w:szCs w:val="28"/>
+          <w:lang w:val="en-US" w:bidi="ar-SA"/>
+        </w:rPr>
+        <w:t>(5×1=5)  </w:t>
+      </w:r>
+    </w:p>
+    <w:p>
+      <w:pPr>
+        <w:spacing w:after="0" w:line="240" w:lineRule="auto"/>
+        <w:jc w:val="both"/>
+        <w:rPr>
+          <w:rFonts w:ascii="Times New Roman" w:eastAsia="Times New Roman" w:hAnsi="Times New Roman" w:cs="Times New Roman"/>
+          <w:sz w:val="28"/>
+          <w:szCs w:val="28"/>
+          <w:lang w:val="en-US" w:bidi="ar-SA"/>
+        </w:rPr>
+      </w:pPr>
+      <w:r>
+        <w:rPr>
+          <w:rFonts w:ascii="Times New Roman" w:eastAsia="Times New Roman" w:hAnsi="Times New Roman" w:cs="Times New Roman"/>
+          <w:sz w:val="28"/>
+          <w:szCs w:val="28"/>
+          <w:lang w:val="en-US" w:bidi="ar-SA"/>
+        </w:rPr>
+        <w:t>i) Mahabir Pun is a Nepalese teacher.</w:t>
+      </w:r>
+    </w:p>
+    <w:p>
+      <w:pPr>
+        <w:spacing w:after="0" w:line="240" w:lineRule="auto"/>
+        <w:jc w:val="both"/>
+        <w:rPr>
+          <w:rFonts w:ascii="Times New Roman" w:eastAsia="Times New Roman" w:hAnsi="Times New Roman" w:cs="Times New Roman"/>
+          <w:sz w:val="28"/>
+          <w:szCs w:val="28"/>
+          <w:lang w:val="en-US" w:bidi="ar-SA"/>
+        </w:rPr>
+      </w:pPr>
+      <w:r>
+        <w:rPr>
+          <w:rFonts w:ascii="Times New Roman" w:eastAsia="Times New Roman" w:hAnsi="Times New Roman" w:cs="Times New Roman"/>
+          <w:sz w:val="28"/>
+          <w:szCs w:val="28"/>
+          <w:lang w:val="en-US" w:bidi="ar-SA"/>
+        </w:rPr>
+        <w:t>ii) His work is not inspiring many youths to serve the country.</w:t>
+      </w:r>
+    </w:p>
+    <w:p>
+      <w:pPr>
+        <w:spacing w:after="0" w:line="240" w:lineRule="auto"/>
+        <w:jc w:val="both"/>
+        <w:rPr>
+          <w:rFonts w:ascii="Times New Roman" w:eastAsia="Times New Roman" w:hAnsi="Times New Roman" w:cs="Times New Roman"/>
+          <w:sz w:val="28"/>
+          <w:szCs w:val="28"/>
+          <w:lang w:val="en-US" w:bidi="ar-SA"/>
+        </w:rPr>
+      </w:pPr>
+      <w:r>
+        <w:rPr>
+          <w:rFonts w:ascii="Times New Roman" w:eastAsia="Times New Roman" w:hAnsi="Times New Roman" w:cs="Times New Roman"/>
+          <w:sz w:val="28"/>
+          <w:szCs w:val="28"/>
+          <w:lang w:val="en-US" w:bidi="ar-SA"/>
+        </w:rPr>
+        <w:t xml:space="preserve">iii) He is the founder of a </w:t>
+      </w:r>
+      <w:r>
+        <w:rPr>
+          <w:rFonts w:ascii="Times New Roman" w:eastAsia="Times New Roman" w:hAnsi="Times New Roman" w:cs="Times New Roman"/>
+          <w:sz w:val="28"/>
+          <w:szCs w:val="28"/>
+          <w:lang w:val="en-US" w:bidi="ar-SA"/>
+        </w:rPr>
+        <w:t>non-profit</w:t>
+      </w:r>
+      <w:r>
+        <w:rPr>
+          <w:rFonts w:ascii="Times New Roman" w:eastAsia="Times New Roman" w:hAnsi="Times New Roman" w:cs="Times New Roman"/>
+          <w:sz w:val="28"/>
+          <w:szCs w:val="28"/>
+          <w:lang w:val="en-US" w:bidi="ar-SA"/>
+        </w:rPr>
+        <w:t xml:space="preserve"> organization.</w:t>
+      </w:r>
+    </w:p>
+    <w:p>
+      <w:pPr>
+        <w:spacing w:after="0" w:line="240" w:lineRule="auto"/>
+        <w:jc w:val="both"/>
+        <w:rPr>
+          <w:rFonts w:ascii="Times New Roman" w:eastAsia="Times New Roman" w:hAnsi="Times New Roman" w:cs="Times New Roman"/>
+          <w:sz w:val="28"/>
+          <w:szCs w:val="28"/>
+          <w:lang w:val="en-US" w:bidi="ar-SA"/>
+        </w:rPr>
+      </w:pPr>
+      <w:r>
+        <w:rPr>
+          <w:rFonts w:ascii="Times New Roman" w:eastAsia="Times New Roman" w:hAnsi="Times New Roman" w:cs="Times New Roman"/>
+          <w:sz w:val="28"/>
+          <w:szCs w:val="28"/>
+          <w:lang w:val="en-US" w:bidi="ar-SA"/>
+        </w:rPr>
+        <w:t>iv) He has not built community-run schools.</w:t>
+      </w:r>
+    </w:p>
+    <w:p>
+      <w:pPr>
+        <w:spacing w:after="0" w:line="240" w:lineRule="auto"/>
+        <w:jc w:val="both"/>
+        <w:rPr>
+          <w:rFonts w:ascii="Times New Roman" w:eastAsia="Times New Roman" w:hAnsi="Times New Roman" w:cs="Times New Roman"/>
+          <w:sz w:val="28"/>
+          <w:szCs w:val="28"/>
+          <w:lang w:val="en-US" w:bidi="ar-SA"/>
+        </w:rPr>
+      </w:pPr>
+      <w:r>
+        <w:rPr>
+          <w:rFonts w:ascii="Times New Roman" w:eastAsia="Times New Roman" w:hAnsi="Times New Roman" w:cs="Times New Roman"/>
+          <w:sz w:val="28"/>
+          <w:szCs w:val="28"/>
+          <w:lang w:val="en-US" w:bidi="ar-SA"/>
+        </w:rPr>
+        <w:t>v</w:t>
+      </w:r>
+      <w:r>
+        <w:rPr>
+          <w:rFonts w:ascii="Times New Roman" w:eastAsia="Times New Roman" w:hAnsi="Times New Roman" w:cs="Times New Roman"/>
+          <w:sz w:val="28"/>
+          <w:szCs w:val="28"/>
+          <w:lang w:val="en-US" w:bidi="ar-SA"/>
+        </w:rPr>
+        <w:t xml:space="preserve">) </w:t>
+      </w:r>
+      <w:r>
+        <w:rPr>
+          <w:rFonts w:ascii="Times New Roman" w:eastAsia="Times New Roman" w:hAnsi="Times New Roman" w:cs="Times New Roman"/>
+          <w:sz w:val="28"/>
+          <w:szCs w:val="28"/>
+          <w:lang w:val="en-US" w:bidi="ar-SA"/>
+        </w:rPr>
+        <w:t>He has built community -run schools.</w:t>
+      </w:r>
+    </w:p>
+    <w:p>
+      <w:pPr>
+        <w:spacing w:after="0" w:line="240" w:lineRule="auto"/>
+        <w:jc w:val="both"/>
+        <w:rPr>
+          <w:rFonts w:ascii="Times New Roman" w:eastAsia="Times New Roman" w:hAnsi="Times New Roman" w:cs="Times New Roman"/>
+          <w:sz w:val="28"/>
+          <w:szCs w:val="28"/>
+          <w:lang w:val="en-US" w:bidi="ar-SA"/>
+        </w:rPr>
+      </w:pPr>
+    </w:p>
+    <w:p>
+      <w:pPr>
+        <w:spacing w:after="0" w:line="240" w:lineRule="auto"/>
+        <w:jc w:val="both"/>
+        <w:rPr>
+          <w:rFonts w:ascii="Times New Roman" w:eastAsia="Times New Roman" w:hAnsi="Times New Roman" w:cs="Times New Roman"/>
+          <w:b/>
+          <w:sz w:val="28"/>
+          <w:szCs w:val="28"/>
+          <w:lang w:val="en-US" w:bidi="ar-SA"/>
+        </w:rPr>
+      </w:pPr>
+      <w:r>
+        <w:rPr>
+          <w:rFonts w:ascii="Times New Roman" w:eastAsia="Times New Roman" w:hAnsi="Times New Roman" w:cs="Times New Roman"/>
+          <w:b/>
+          <w:sz w:val="28"/>
+          <w:szCs w:val="28"/>
+          <w:lang w:val="en-US" w:bidi="ar-SA"/>
+        </w:rPr>
+        <w:t>2.</w:t>
       </w:r>
       <w:r>
         <w:rPr>
@@ -784,233 +920,6 @@
           <w:szCs w:val="28"/>
           <w:lang w:val="en-US" w:bidi="ar-SA"/>
         </w:rPr>
-        <w:t xml:space="preserve">Write True or False. </w:t>
-      </w:r>
-      <w:r>
-        <w:rPr>
-          <w:rFonts w:ascii="Times New Roman" w:eastAsia="Times New Roman" w:hAnsi="Times New Roman" w:cs="Times New Roman"/>
-          <w:b/>
-          <w:sz w:val="28"/>
-          <w:szCs w:val="28"/>
-          <w:lang w:val="en-US" w:bidi="ar-SA"/>
-        </w:rPr>
-        <w:t xml:space="preserve">                                                </w:t>
-      </w:r>
-      <w:r>
-        <w:rPr>
-          <w:rFonts w:ascii="Times New Roman" w:eastAsia="Times New Roman" w:hAnsi="Times New Roman" w:cs="Times New Roman"/>
-          <w:b/>
-          <w:sz w:val="28"/>
-          <w:szCs w:val="28"/>
-          <w:lang w:val="en-US" w:bidi="ar-SA"/>
-        </w:rPr>
-        <w:t>(5×1=5)  </w:t>
-      </w:r>
-    </w:p>
-    <w:p>
-      <w:pPr>
-        <w:spacing w:after="0" w:line="240" w:lineRule="auto"/>
-        <w:jc w:val="both"/>
-        <w:rPr>
-          <w:rFonts w:ascii="Times New Roman" w:eastAsia="Times New Roman" w:hAnsi="Times New Roman" w:cs="Times New Roman"/>
-          <w:sz w:val="28"/>
-          <w:szCs w:val="28"/>
-          <w:lang w:val="en-US" w:bidi="ar-SA"/>
-        </w:rPr>
-      </w:pPr>
-      <w:proofErr w:type="spellStart"/>
-      <w:r>
-        <w:rPr>
-          <w:rFonts w:ascii="Times New Roman" w:eastAsia="Times New Roman" w:hAnsi="Times New Roman" w:cs="Times New Roman"/>
-          <w:sz w:val="28"/>
-          <w:szCs w:val="28"/>
-          <w:lang w:val="en-US" w:bidi="ar-SA"/>
-        </w:rPr>
-        <w:t>i</w:t>
-      </w:r>
-      <w:proofErr w:type="spellEnd"/>
-      <w:r>
-        <w:rPr>
-          <w:rFonts w:ascii="Times New Roman" w:eastAsia="Times New Roman" w:hAnsi="Times New Roman" w:cs="Times New Roman"/>
-          <w:sz w:val="28"/>
-          <w:szCs w:val="28"/>
-          <w:lang w:val="en-US" w:bidi="ar-SA"/>
-        </w:rPr>
-        <w:t>) Mahabir Pun is a Nepalese teacher.</w:t>
-      </w:r>
-    </w:p>
-    <w:p>
-      <w:pPr>
-        <w:spacing w:after="0" w:line="240" w:lineRule="auto"/>
-        <w:jc w:val="both"/>
-        <w:rPr>
-          <w:rFonts w:ascii="Times New Roman" w:eastAsia="Times New Roman" w:hAnsi="Times New Roman" w:cs="Times New Roman"/>
-          <w:sz w:val="28"/>
-          <w:szCs w:val="28"/>
-          <w:lang w:val="en-US" w:bidi="ar-SA"/>
-        </w:rPr>
-      </w:pPr>
-      <w:r>
-        <w:rPr>
-          <w:rFonts w:ascii="Times New Roman" w:eastAsia="Times New Roman" w:hAnsi="Times New Roman" w:cs="Times New Roman"/>
-          <w:sz w:val="28"/>
-          <w:szCs w:val="28"/>
-          <w:lang w:val="en-US" w:bidi="ar-SA"/>
-        </w:rPr>
-        <w:t>ii) His work is not inspiring many youths to serve the country.</w:t>
-      </w:r>
-    </w:p>
-    <w:p>
-      <w:pPr>
-        <w:spacing w:after="0" w:line="240" w:lineRule="auto"/>
-        <w:jc w:val="both"/>
-        <w:rPr>
-          <w:rFonts w:ascii="Times New Roman" w:eastAsia="Times New Roman" w:hAnsi="Times New Roman" w:cs="Times New Roman"/>
-          <w:sz w:val="28"/>
-          <w:szCs w:val="28"/>
-          <w:lang w:val="en-US" w:bidi="ar-SA"/>
-        </w:rPr>
-      </w:pPr>
-      <w:r>
-        <w:rPr>
-          <w:rFonts w:ascii="Times New Roman" w:eastAsia="Times New Roman" w:hAnsi="Times New Roman" w:cs="Times New Roman"/>
-          <w:sz w:val="28"/>
-          <w:szCs w:val="28"/>
-          <w:lang w:val="en-US" w:bidi="ar-SA"/>
-        </w:rPr>
-        <w:t xml:space="preserve">iii) He is the founder of a </w:t>
-      </w:r>
-      <w:r>
-        <w:rPr>
-          <w:rFonts w:ascii="Times New Roman" w:eastAsia="Times New Roman" w:hAnsi="Times New Roman" w:cs="Times New Roman"/>
-          <w:sz w:val="28"/>
-          <w:szCs w:val="28"/>
-          <w:lang w:val="en-US" w:bidi="ar-SA"/>
-        </w:rPr>
-        <w:t>non-profit</w:t>
-      </w:r>
-      <w:r>
-        <w:rPr>
-          <w:rFonts w:ascii="Times New Roman" w:eastAsia="Times New Roman" w:hAnsi="Times New Roman" w:cs="Times New Roman"/>
-          <w:sz w:val="28"/>
-          <w:szCs w:val="28"/>
-          <w:lang w:val="en-US" w:bidi="ar-SA"/>
-        </w:rPr>
-        <w:t xml:space="preserve"> organization.</w:t>
-      </w:r>
-    </w:p>
-    <w:p>
-      <w:pPr>
-        <w:spacing w:after="0" w:line="240" w:lineRule="auto"/>
-        <w:jc w:val="both"/>
-        <w:rPr>
-          <w:rFonts w:ascii="Times New Roman" w:eastAsia="Times New Roman" w:hAnsi="Times New Roman" w:cs="Times New Roman"/>
-          <w:sz w:val="28"/>
-          <w:szCs w:val="28"/>
-          <w:lang w:val="en-US" w:bidi="ar-SA"/>
-        </w:rPr>
-      </w:pPr>
-      <w:r>
-        <w:rPr>
-          <w:rFonts w:ascii="Times New Roman" w:eastAsia="Times New Roman" w:hAnsi="Times New Roman" w:cs="Times New Roman"/>
-          <w:sz w:val="28"/>
-          <w:szCs w:val="28"/>
-          <w:lang w:val="en-US" w:bidi="ar-SA"/>
-        </w:rPr>
-        <w:t>iv) He has not built community-run schools.</w:t>
-      </w:r>
-    </w:p>
-    <w:p>
-      <w:pPr>
-        <w:spacing w:after="0" w:line="240" w:lineRule="auto"/>
-        <w:jc w:val="both"/>
-        <w:rPr>
-          <w:rFonts w:ascii="Times New Roman" w:eastAsia="Times New Roman" w:hAnsi="Times New Roman" w:cs="Times New Roman"/>
-          <w:sz w:val="28"/>
-          <w:szCs w:val="28"/>
-          <w:lang w:val="en-US" w:bidi="ar-SA"/>
-        </w:rPr>
-      </w:pPr>
-      <w:r>
-        <w:rPr>
-          <w:rFonts w:ascii="Times New Roman" w:eastAsia="Times New Roman" w:hAnsi="Times New Roman" w:cs="Times New Roman"/>
-          <w:sz w:val="28"/>
-          <w:szCs w:val="28"/>
-          <w:lang w:val="en-US" w:bidi="ar-SA"/>
-        </w:rPr>
-        <w:t>v</w:t>
-      </w:r>
-      <w:r>
-        <w:rPr>
-          <w:rFonts w:ascii="Times New Roman" w:eastAsia="Times New Roman" w:hAnsi="Times New Roman" w:cs="Times New Roman"/>
-          <w:sz w:val="28"/>
-          <w:szCs w:val="28"/>
-          <w:lang w:val="en-US" w:bidi="ar-SA"/>
-        </w:rPr>
-        <w:t xml:space="preserve">) </w:t>
-      </w:r>
-      <w:r>
-        <w:rPr>
-          <w:rFonts w:ascii="Times New Roman" w:eastAsia="Times New Roman" w:hAnsi="Times New Roman" w:cs="Times New Roman"/>
-          <w:sz w:val="28"/>
-          <w:szCs w:val="28"/>
-          <w:lang w:val="en-US" w:bidi="ar-SA"/>
-        </w:rPr>
-        <w:t>He has built community -run schools.</w:t>
-      </w:r>
-    </w:p>
-    <w:p>
-      <w:pPr>
-        <w:spacing w:after="0" w:line="240" w:lineRule="auto"/>
-        <w:jc w:val="both"/>
-        <w:rPr>
-          <w:rFonts w:ascii="Times New Roman" w:eastAsia="Times New Roman" w:hAnsi="Times New Roman" w:cs="Times New Roman"/>
-          <w:sz w:val="28"/>
-          <w:szCs w:val="28"/>
-          <w:lang w:val="en-US" w:bidi="ar-SA"/>
-        </w:rPr>
-      </w:pPr>
-    </w:p>
-    <w:p>
-      <w:pPr>
-        <w:spacing w:after="0" w:line="240" w:lineRule="auto"/>
-        <w:jc w:val="both"/>
-        <w:rPr>
-          <w:rFonts w:ascii="Times New Roman" w:eastAsia="Times New Roman" w:hAnsi="Times New Roman" w:cs="Times New Roman"/>
-          <w:b/>
-          <w:sz w:val="28"/>
-          <w:szCs w:val="28"/>
-          <w:lang w:val="en-US" w:bidi="ar-SA"/>
-        </w:rPr>
-      </w:pPr>
-      <w:r>
-        <w:rPr>
-          <w:rFonts w:ascii="Times New Roman" w:eastAsia="Times New Roman" w:hAnsi="Times New Roman" w:cs="Times New Roman"/>
-          <w:b/>
-          <w:sz w:val="28"/>
-          <w:szCs w:val="28"/>
-          <w:lang w:val="en-US" w:bidi="ar-SA"/>
-        </w:rPr>
-        <w:t>2.</w:t>
-      </w:r>
-      <w:r>
-        <w:rPr>
-          <w:rFonts w:ascii="Times New Roman" w:eastAsia="Times New Roman" w:hAnsi="Times New Roman" w:cs="Times New Roman"/>
-          <w:b/>
-          <w:sz w:val="28"/>
-          <w:szCs w:val="28"/>
-          <w:lang w:val="en-US" w:bidi="ar-SA"/>
-        </w:rPr>
-        <w:t xml:space="preserve"> </w:t>
-      </w:r>
-      <w:r>
-        <w:rPr>
-          <w:rFonts w:ascii="Times New Roman" w:eastAsia="Times New Roman" w:hAnsi="Times New Roman" w:cs="Times New Roman"/>
-          <w:b/>
-          <w:sz w:val="28"/>
-          <w:szCs w:val="28"/>
-          <w:lang w:val="en-US" w:bidi="ar-SA"/>
-        </w:rPr>
         <w:t>Read the following passage and do the activities below.</w:t>
       </w:r>
     </w:p>
@@ -1032,27 +941,7 @@
           <w:szCs w:val="28"/>
           <w:lang w:val="en-US" w:bidi="ar-SA"/>
         </w:rPr>
-        <w:t xml:space="preserve">Tim Berners-Lee is the inventor of the world wide web. He invented it in 1989. He was born in London on June 8, 1955. His parents were mathematicians who worked on the Mark I computer. They encouraged Tim's interest in </w:t>
-      </w:r>
-      <w:proofErr w:type="spellStart"/>
-      <w:r>
-        <w:rPr>
-          <w:rFonts w:ascii="Times New Roman" w:eastAsia="Times New Roman" w:hAnsi="Times New Roman" w:cs="Times New Roman"/>
-          <w:sz w:val="28"/>
-          <w:szCs w:val="28"/>
-          <w:lang w:val="en-US" w:bidi="ar-SA"/>
-        </w:rPr>
-        <w:t>maths</w:t>
-      </w:r>
-      <w:proofErr w:type="spellEnd"/>
-      <w:r>
-        <w:rPr>
-          <w:rFonts w:ascii="Times New Roman" w:eastAsia="Times New Roman" w:hAnsi="Times New Roman" w:cs="Times New Roman"/>
-          <w:sz w:val="28"/>
-          <w:szCs w:val="28"/>
-          <w:lang w:val="en-US" w:bidi="ar-SA"/>
-        </w:rPr>
-        <w:t xml:space="preserve"> and electronics. He majored in Physics at Queen's college, Oxford while he was there, he built his own computer out of the spare </w:t>
+        <w:t xml:space="preserve">Tim Berners-Lee is the inventor of the world wide web. He invented it in 1989. He was born in London on June 8, 1955. His parents were mathematicians who worked on the Mark I computer. They encouraged Tim's interest in maths and electronics. He majored in Physics at Queen's college, Oxford while he was there, he built his own computer out of the spare </w:t>
       </w:r>
       <w:r>
         <w:rPr>
@@ -1117,25 +1006,14 @@
           <w:lang w:val="en-US" w:bidi="ar-SA"/>
         </w:rPr>
       </w:pPr>
-      <w:proofErr w:type="spellStart"/>
-      <w:r>
-        <w:rPr>
-          <w:rFonts w:ascii="Times New Roman" w:eastAsia="Times New Roman" w:hAnsi="Times New Roman" w:cs="Times New Roman"/>
-          <w:sz w:val="28"/>
-          <w:szCs w:val="28"/>
-          <w:lang w:val="en-US" w:bidi="ar-SA"/>
-        </w:rPr>
-        <w:t>i</w:t>
-      </w:r>
-      <w:proofErr w:type="spellEnd"/>
-      <w:r>
-        <w:rPr>
-          <w:rFonts w:ascii="Times New Roman" w:eastAsia="Times New Roman" w:hAnsi="Times New Roman" w:cs="Times New Roman"/>
-          <w:sz w:val="28"/>
-          <w:szCs w:val="28"/>
-          <w:lang w:val="en-US" w:bidi="ar-SA"/>
-        </w:rPr>
-        <w:t>) He invented .........</w:t>
+      <w:r>
+        <w:rPr>
+          <w:rFonts w:ascii="Times New Roman" w:eastAsia="Times New Roman" w:hAnsi="Times New Roman" w:cs="Times New Roman"/>
+          <w:sz w:val="28"/>
+          <w:szCs w:val="28"/>
+          <w:lang w:val="en-US" w:bidi="ar-SA"/>
+        </w:rPr>
+        <w:t>i) He invented .........</w:t>
       </w:r>
     </w:p>
     <w:p>
@@ -1623,47 +1501,505 @@
         <w:jc w:val="both"/>
         <w:rPr>
           <w:rFonts w:ascii="Times New Roman" w:eastAsia="Times New Roman" w:hAnsi="Times New Roman" w:cs="Times New Roman"/>
-          <w:sz w:val="28"/>
-          <w:szCs w:val="28"/>
-          <w:lang w:val="en-US" w:bidi="ar-SA"/>
-        </w:rPr>
-      </w:pPr>
-    </w:p>
-    <w:p>
-      <w:pPr>
-        <w:spacing w:after="0" w:line="240" w:lineRule="auto"/>
-        <w:jc w:val="both"/>
-        <w:rPr>
-          <w:rFonts w:ascii="Times New Roman" w:eastAsia="Times New Roman" w:hAnsi="Times New Roman" w:cs="Times New Roman"/>
-          <w:b/>
-          <w:sz w:val="28"/>
-          <w:szCs w:val="28"/>
-          <w:lang w:val="en-US" w:bidi="ar-SA"/>
-        </w:rPr>
-      </w:pPr>
-      <w:r>
-        <w:rPr>
-          <w:rFonts w:ascii="Times New Roman" w:eastAsia="Times New Roman" w:hAnsi="Times New Roman" w:cs="Times New Roman"/>
-          <w:b/>
-          <w:sz w:val="28"/>
-          <w:szCs w:val="28"/>
-          <w:lang w:val="en-US" w:bidi="ar-SA"/>
-        </w:rPr>
-        <w:t>A.</w:t>
-      </w:r>
-      <w:r>
-        <w:rPr>
-          <w:rFonts w:ascii="Times New Roman" w:eastAsia="Times New Roman" w:hAnsi="Times New Roman" w:cs="Times New Roman"/>
-          <w:b/>
-          <w:sz w:val="28"/>
-          <w:szCs w:val="28"/>
-          <w:lang w:val="en-US" w:bidi="ar-SA"/>
+          <w:b/>
+          <w:bCs/>
+          <w:sz w:val="28"/>
+          <w:szCs w:val="28"/>
+          <w:lang w:val="en-US" w:bidi="ar-SA"/>
+        </w:rPr>
+      </w:pPr>
+      <w:r>
+        <w:rPr>
+          <w:rFonts w:ascii="Times New Roman" w:eastAsia="Times New Roman" w:hAnsi="Times New Roman" w:cs="Times New Roman"/>
+          <w:b/>
+          <w:bCs/>
+          <w:sz w:val="28"/>
+          <w:szCs w:val="28"/>
+          <w:lang w:val="en-US" w:bidi="ar-SA"/>
+        </w:rPr>
+        <w:t>A. Match the following.</w:t>
+      </w:r>
+      <w:r>
+        <w:rPr>
+          <w:rFonts w:ascii="Times New Roman" w:eastAsia="Times New Roman" w:hAnsi="Times New Roman" w:cs="Times New Roman"/>
+          <w:b/>
+          <w:bCs/>
+          <w:sz w:val="28"/>
+          <w:szCs w:val="28"/>
+          <w:lang w:val="en-US" w:bidi="ar-SA"/>
+        </w:rPr>
+        <w:tab/>
+      </w:r>
+      <w:r>
+        <w:rPr>
+          <w:rFonts w:ascii="Times New Roman" w:eastAsia="Times New Roman" w:hAnsi="Times New Roman" w:cs="Times New Roman"/>
+          <w:b/>
+          <w:bCs/>
+          <w:sz w:val="28"/>
+          <w:szCs w:val="28"/>
+          <w:lang w:val="en-US" w:bidi="ar-SA"/>
+        </w:rPr>
+        <w:tab/>
+      </w:r>
+      <w:r>
+        <w:rPr>
+          <w:rFonts w:ascii="Times New Roman" w:eastAsia="Times New Roman" w:hAnsi="Times New Roman" w:cs="Times New Roman"/>
+          <w:b/>
+          <w:bCs/>
+          <w:sz w:val="28"/>
+          <w:szCs w:val="28"/>
+          <w:lang w:val="en-US" w:bidi="ar-SA"/>
+        </w:rPr>
+        <w:tab/>
+      </w:r>
+      <w:r>
+        <w:rPr>
+          <w:rFonts w:ascii="Times New Roman" w:eastAsia="Times New Roman" w:hAnsi="Times New Roman" w:cs="Times New Roman"/>
+          <w:b/>
+          <w:bCs/>
+          <w:sz w:val="28"/>
+          <w:szCs w:val="28"/>
+          <w:lang w:val="en-US" w:bidi="ar-SA"/>
+        </w:rPr>
+        <w:tab/>
+      </w:r>
+      <w:r>
+        <w:rPr>
+          <w:rFonts w:ascii="Times New Roman" w:eastAsia="Times New Roman" w:hAnsi="Times New Roman" w:cs="Times New Roman"/>
+          <w:b/>
+          <w:bCs/>
+          <w:sz w:val="28"/>
+          <w:szCs w:val="28"/>
+          <w:lang w:val="en-US" w:bidi="ar-SA"/>
+        </w:rPr>
+        <w:tab/>
+      </w:r>
+      <w:r>
+        <w:rPr>
+          <w:rFonts w:ascii="Times New Roman" w:eastAsia="Times New Roman" w:hAnsi="Times New Roman" w:cs="Times New Roman"/>
+          <w:b/>
+          <w:bCs/>
+          <w:sz w:val="28"/>
+          <w:szCs w:val="28"/>
+          <w:lang w:val="en-US" w:bidi="ar-SA"/>
+        </w:rPr>
+        <w:t>(5×1=5)</w:t>
+      </w:r>
+    </w:p>
+    <w:p>
+      <w:pPr>
+        <w:spacing w:after="0" w:line="240" w:lineRule="auto"/>
+        <w:jc w:val="both"/>
+        <w:rPr>
+          <w:rFonts w:ascii="Times New Roman" w:eastAsia="Times New Roman" w:hAnsi="Times New Roman" w:cs="Times New Roman"/>
+          <w:sz w:val="28"/>
+          <w:szCs w:val="28"/>
+          <w:lang w:bidi="ar-SA"/>
+        </w:rPr>
+      </w:pPr>
+      <w:r>
+        <w:rPr>
+          <w:rFonts w:ascii="Times New Roman" w:eastAsia="Times New Roman" w:hAnsi="Times New Roman" w:cs="Times New Roman"/>
+          <w:sz w:val="28"/>
+          <w:szCs w:val="28"/>
+          <w:lang w:bidi="ar-SA"/>
+        </w:rPr>
+        <w:t xml:space="preserve">a. </w:t>
+      </w:r>
+      <w:r>
+        <w:rPr>
+          <w:rFonts w:ascii="Times New Roman" w:eastAsia="Times New Roman" w:hAnsi="Times New Roman" w:cs="Times New Roman"/>
+          <w:sz w:val="28"/>
+          <w:szCs w:val="28"/>
+          <w:lang w:bidi="ar-SA"/>
+        </w:rPr>
+        <w:t>Christianity</w:t>
+      </w:r>
+      <w:r>
+        <w:rPr>
+          <w:rFonts w:ascii="Times New Roman" w:eastAsia="Times New Roman" w:hAnsi="Times New Roman" w:cs="Times New Roman"/>
+          <w:sz w:val="28"/>
+          <w:szCs w:val="28"/>
+          <w:lang w:bidi="ar-SA"/>
+        </w:rPr>
+        <w:tab/>
+      </w:r>
+      <w:r>
+        <w:rPr>
+          <w:rFonts w:ascii="Times New Roman" w:eastAsia="Times New Roman" w:hAnsi="Times New Roman" w:cs="Times New Roman"/>
+          <w:sz w:val="28"/>
+          <w:szCs w:val="28"/>
+          <w:lang w:bidi="ar-SA"/>
         </w:rPr>
         <w:t xml:space="preserve"> </w:t>
       </w:r>
       <w:r>
         <w:rPr>
           <w:rFonts w:ascii="Times New Roman" w:eastAsia="Times New Roman" w:hAnsi="Times New Roman" w:cs="Times New Roman"/>
+          <w:sz w:val="28"/>
+          <w:szCs w:val="28"/>
+          <w:lang w:bidi="ar-SA"/>
+        </w:rPr>
+        <w:tab/>
+      </w:r>
+      <w:r>
+        <w:rPr>
+          <w:rFonts w:ascii="Times New Roman" w:eastAsia="Times New Roman" w:hAnsi="Times New Roman" w:cs="Times New Roman"/>
+          <w:sz w:val="28"/>
+          <w:szCs w:val="28"/>
+          <w:lang w:bidi="ar-SA"/>
+        </w:rPr>
+        <w:tab/>
+      </w:r>
+      <w:r>
+        <w:rPr>
+          <w:rFonts w:ascii="Times New Roman" w:eastAsia="Times New Roman" w:hAnsi="Times New Roman" w:cs="Times New Roman"/>
+          <w:sz w:val="28"/>
+          <w:szCs w:val="28"/>
+          <w:lang w:bidi="ar-SA"/>
+        </w:rPr>
+        <w:t>Another name of Ireland</w:t>
+      </w:r>
+    </w:p>
+    <w:p>
+      <w:pPr>
+        <w:spacing w:after="0" w:line="240" w:lineRule="auto"/>
+        <w:jc w:val="both"/>
+        <w:rPr>
+          <w:rFonts w:ascii="Times New Roman" w:eastAsia="Times New Roman" w:hAnsi="Times New Roman" w:cs="Times New Roman"/>
+          <w:sz w:val="28"/>
+          <w:szCs w:val="28"/>
+          <w:lang w:bidi="ar-SA"/>
+        </w:rPr>
+      </w:pPr>
+      <w:r>
+        <w:rPr>
+          <w:rFonts w:ascii="Times New Roman" w:eastAsia="Times New Roman" w:hAnsi="Times New Roman" w:cs="Times New Roman"/>
+          <w:sz w:val="28"/>
+          <w:szCs w:val="28"/>
+          <w:lang w:bidi="ar-SA"/>
+        </w:rPr>
+        <w:t xml:space="preserve">b. </w:t>
+      </w:r>
+      <w:r>
+        <w:rPr>
+          <w:rFonts w:ascii="Times New Roman" w:eastAsia="Times New Roman" w:hAnsi="Times New Roman" w:cs="Times New Roman"/>
+          <w:sz w:val="28"/>
+          <w:szCs w:val="28"/>
+          <w:lang w:bidi="ar-SA"/>
+        </w:rPr>
+        <w:t>United Kingdom</w:t>
+      </w:r>
+      <w:r>
+        <w:rPr>
+          <w:rFonts w:ascii="Times New Roman" w:eastAsia="Times New Roman" w:hAnsi="Times New Roman" w:cs="Times New Roman"/>
+          <w:sz w:val="28"/>
+          <w:szCs w:val="28"/>
+          <w:lang w:bidi="ar-SA"/>
+        </w:rPr>
+        <w:tab/>
+      </w:r>
+      <w:r>
+        <w:rPr>
+          <w:rFonts w:ascii="Times New Roman" w:eastAsia="Times New Roman" w:hAnsi="Times New Roman" w:cs="Times New Roman"/>
+          <w:sz w:val="28"/>
+          <w:szCs w:val="28"/>
+          <w:lang w:bidi="ar-SA"/>
+        </w:rPr>
+        <w:tab/>
+      </w:r>
+      <w:r>
+        <w:rPr>
+          <w:rFonts w:ascii="Times New Roman" w:eastAsia="Times New Roman" w:hAnsi="Times New Roman" w:cs="Times New Roman"/>
+          <w:sz w:val="28"/>
+          <w:szCs w:val="28"/>
+          <w:lang w:bidi="ar-SA"/>
+        </w:rPr>
+        <w:t>National holiday</w:t>
+      </w:r>
+    </w:p>
+    <w:p>
+      <w:pPr>
+        <w:spacing w:after="0" w:line="240" w:lineRule="auto"/>
+        <w:jc w:val="both"/>
+        <w:rPr>
+          <w:rFonts w:ascii="Times New Roman" w:eastAsia="Times New Roman" w:hAnsi="Times New Roman" w:cs="Times New Roman"/>
+          <w:sz w:val="28"/>
+          <w:szCs w:val="28"/>
+          <w:lang w:bidi="ar-SA"/>
+        </w:rPr>
+      </w:pPr>
+      <w:r>
+        <w:rPr>
+          <w:rFonts w:ascii="Times New Roman" w:eastAsia="Times New Roman" w:hAnsi="Times New Roman" w:cs="Times New Roman"/>
+          <w:sz w:val="28"/>
+          <w:szCs w:val="28"/>
+          <w:lang w:bidi="ar-SA"/>
+        </w:rPr>
+        <w:t xml:space="preserve">c. </w:t>
+      </w:r>
+      <w:r>
+        <w:rPr>
+          <w:rFonts w:ascii="Times New Roman" w:eastAsia="Times New Roman" w:hAnsi="Times New Roman" w:cs="Times New Roman"/>
+          <w:sz w:val="28"/>
+          <w:szCs w:val="28"/>
+          <w:lang w:bidi="ar-SA"/>
+        </w:rPr>
+        <w:t xml:space="preserve">Saint Patrick’s Day </w:t>
+      </w:r>
+      <w:r>
+        <w:rPr>
+          <w:rFonts w:ascii="Times New Roman" w:eastAsia="Times New Roman" w:hAnsi="Times New Roman" w:cs="Times New Roman"/>
+          <w:sz w:val="28"/>
+          <w:szCs w:val="28"/>
+          <w:lang w:bidi="ar-SA"/>
+        </w:rPr>
+        <w:t xml:space="preserve"> </w:t>
+      </w:r>
+      <w:r>
+        <w:rPr>
+          <w:rFonts w:ascii="Times New Roman" w:eastAsia="Times New Roman" w:hAnsi="Times New Roman" w:cs="Times New Roman"/>
+          <w:sz w:val="28"/>
+          <w:szCs w:val="28"/>
+          <w:lang w:bidi="ar-SA"/>
+        </w:rPr>
+        <w:tab/>
+      </w:r>
+      <w:r>
+        <w:rPr>
+          <w:rFonts w:ascii="Times New Roman" w:eastAsia="Times New Roman" w:hAnsi="Times New Roman" w:cs="Times New Roman"/>
+          <w:sz w:val="28"/>
+          <w:szCs w:val="28"/>
+          <w:lang w:bidi="ar-SA"/>
+        </w:rPr>
+        <w:tab/>
+      </w:r>
+      <w:r>
+        <w:rPr>
+          <w:rFonts w:ascii="Times New Roman" w:eastAsia="Times New Roman" w:hAnsi="Times New Roman" w:cs="Times New Roman"/>
+          <w:sz w:val="28"/>
+          <w:szCs w:val="28"/>
+          <w:lang w:bidi="ar-SA"/>
+        </w:rPr>
+        <w:t>Main religion of people</w:t>
+      </w:r>
+    </w:p>
+    <w:p>
+      <w:pPr>
+        <w:spacing w:after="0" w:line="240" w:lineRule="auto"/>
+        <w:jc w:val="both"/>
+        <w:rPr>
+          <w:rFonts w:ascii="Times New Roman" w:eastAsia="Times New Roman" w:hAnsi="Times New Roman" w:cs="Times New Roman"/>
+          <w:sz w:val="28"/>
+          <w:szCs w:val="28"/>
+          <w:lang w:bidi="ar-SA"/>
+        </w:rPr>
+      </w:pPr>
+      <w:r>
+        <w:rPr>
+          <w:rFonts w:ascii="Times New Roman" w:eastAsia="Times New Roman" w:hAnsi="Times New Roman" w:cs="Times New Roman"/>
+          <w:sz w:val="28"/>
+          <w:szCs w:val="28"/>
+          <w:lang w:bidi="ar-SA"/>
+        </w:rPr>
+        <w:t>d.</w:t>
+      </w:r>
+      <w:r>
+        <w:rPr>
+          <w:rFonts w:ascii="Times New Roman" w:eastAsia="Times New Roman" w:hAnsi="Times New Roman" w:cs="Times New Roman"/>
+          <w:sz w:val="28"/>
+          <w:szCs w:val="28"/>
+          <w:lang w:bidi="ar-SA"/>
+        </w:rPr>
+        <w:t xml:space="preserve"> </w:t>
+      </w:r>
+      <w:r>
+        <w:rPr>
+          <w:rFonts w:ascii="Times New Roman" w:eastAsia="Times New Roman" w:hAnsi="Times New Roman" w:cs="Times New Roman"/>
+          <w:sz w:val="28"/>
+          <w:szCs w:val="28"/>
+          <w:lang w:bidi="ar-SA"/>
+        </w:rPr>
+        <w:t>Dublin</w:t>
+      </w:r>
+      <w:r>
+        <w:rPr>
+          <w:rFonts w:ascii="Times New Roman" w:eastAsia="Times New Roman" w:hAnsi="Times New Roman" w:cs="Times New Roman"/>
+          <w:sz w:val="28"/>
+          <w:szCs w:val="28"/>
+          <w:lang w:bidi="ar-SA"/>
+        </w:rPr>
+        <w:tab/>
+      </w:r>
+      <w:r>
+        <w:rPr>
+          <w:rFonts w:ascii="Times New Roman" w:eastAsia="Times New Roman" w:hAnsi="Times New Roman" w:cs="Times New Roman"/>
+          <w:sz w:val="28"/>
+          <w:szCs w:val="28"/>
+          <w:lang w:bidi="ar-SA"/>
+        </w:rPr>
+        <w:tab/>
+      </w:r>
+      <w:r>
+        <w:rPr>
+          <w:rFonts w:ascii="Times New Roman" w:eastAsia="Times New Roman" w:hAnsi="Times New Roman" w:cs="Times New Roman"/>
+          <w:sz w:val="28"/>
+          <w:szCs w:val="28"/>
+          <w:lang w:bidi="ar-SA"/>
+        </w:rPr>
+        <w:tab/>
+      </w:r>
+      <w:r>
+        <w:rPr>
+          <w:rFonts w:ascii="Times New Roman" w:eastAsia="Times New Roman" w:hAnsi="Times New Roman" w:cs="Times New Roman"/>
+          <w:sz w:val="28"/>
+          <w:szCs w:val="28"/>
+          <w:lang w:bidi="ar-SA"/>
+        </w:rPr>
+        <w:tab/>
+      </w:r>
+      <w:r>
+        <w:rPr>
+          <w:rFonts w:ascii="Times New Roman" w:eastAsia="Times New Roman" w:hAnsi="Times New Roman" w:cs="Times New Roman"/>
+          <w:sz w:val="28"/>
+          <w:szCs w:val="28"/>
+          <w:lang w:bidi="ar-SA"/>
+        </w:rPr>
+        <w:t>Largest city of Ireland</w:t>
+      </w:r>
+    </w:p>
+    <w:p>
+      <w:pPr>
+        <w:spacing w:after="0" w:line="240" w:lineRule="auto"/>
+        <w:jc w:val="both"/>
+        <w:rPr>
+          <w:rFonts w:ascii="Times New Roman" w:eastAsia="Times New Roman" w:hAnsi="Times New Roman" w:cs="Times New Roman"/>
+          <w:sz w:val="28"/>
+          <w:szCs w:val="28"/>
+          <w:lang w:val="en-US" w:bidi="ar-SA"/>
+        </w:rPr>
+      </w:pPr>
+      <w:r>
+        <w:rPr>
+          <w:rFonts w:ascii="Times New Roman" w:eastAsia="Times New Roman" w:hAnsi="Times New Roman" w:cs="Times New Roman"/>
+          <w:sz w:val="28"/>
+          <w:szCs w:val="28"/>
+          <w:lang w:bidi="ar-SA"/>
+        </w:rPr>
+        <w:t xml:space="preserve">e. </w:t>
+      </w:r>
+      <w:r>
+        <w:rPr>
+          <w:rFonts w:ascii="Times New Roman" w:eastAsia="Times New Roman" w:hAnsi="Times New Roman" w:cs="Times New Roman"/>
+          <w:sz w:val="28"/>
+          <w:szCs w:val="28"/>
+          <w:lang w:bidi="ar-SA"/>
+        </w:rPr>
+        <w:t xml:space="preserve">17th March </w:t>
+      </w:r>
+      <w:r>
+        <w:rPr>
+          <w:rFonts w:ascii="Times New Roman" w:eastAsia="Times New Roman" w:hAnsi="Times New Roman" w:cs="Times New Roman"/>
+          <w:sz w:val="28"/>
+          <w:szCs w:val="28"/>
+          <w:lang w:bidi="ar-SA"/>
+        </w:rPr>
+        <w:t xml:space="preserve"> </w:t>
+      </w:r>
+      <w:r>
+        <w:rPr>
+          <w:rFonts w:ascii="Times New Roman" w:eastAsia="Times New Roman" w:hAnsi="Times New Roman" w:cs="Times New Roman"/>
+          <w:sz w:val="28"/>
+          <w:szCs w:val="28"/>
+          <w:lang w:bidi="ar-SA"/>
+        </w:rPr>
+        <w:tab/>
+      </w:r>
+      <w:r>
+        <w:rPr>
+          <w:rFonts w:ascii="Times New Roman" w:eastAsia="Times New Roman" w:hAnsi="Times New Roman" w:cs="Times New Roman"/>
+          <w:sz w:val="28"/>
+          <w:szCs w:val="28"/>
+          <w:lang w:bidi="ar-SA"/>
+        </w:rPr>
+        <w:tab/>
+      </w:r>
+      <w:r>
+        <w:rPr>
+          <w:rFonts w:ascii="Times New Roman" w:eastAsia="Times New Roman" w:hAnsi="Times New Roman" w:cs="Times New Roman"/>
+          <w:sz w:val="28"/>
+          <w:szCs w:val="28"/>
+          <w:lang w:bidi="ar-SA"/>
+        </w:rPr>
+        <w:tab/>
+      </w:r>
+      <w:r>
+        <w:rPr>
+          <w:rFonts w:ascii="Times New Roman" w:eastAsia="Times New Roman" w:hAnsi="Times New Roman" w:cs="Times New Roman"/>
+          <w:sz w:val="28"/>
+          <w:szCs w:val="28"/>
+          <w:lang w:bidi="ar-SA"/>
+        </w:rPr>
+        <w:t>Island country in Europe</w:t>
+      </w:r>
+    </w:p>
+    <w:p>
+      <w:pPr>
+        <w:spacing w:after="0" w:line="240" w:lineRule="auto"/>
+        <w:jc w:val="both"/>
+        <w:rPr>
+          <w:rFonts w:ascii="Times New Roman" w:eastAsia="Times New Roman" w:hAnsi="Times New Roman" w:cs="Times New Roman"/>
+          <w:sz w:val="28"/>
+          <w:szCs w:val="28"/>
+          <w:lang w:val="en-US" w:bidi="ar-SA"/>
+        </w:rPr>
+      </w:pPr>
+    </w:p>
+    <w:p>
+      <w:pPr>
+        <w:spacing w:after="0" w:line="240" w:lineRule="auto"/>
+        <w:jc w:val="both"/>
+        <w:rPr>
+          <w:rFonts w:ascii="Times New Roman" w:eastAsia="Times New Roman" w:hAnsi="Times New Roman" w:cs="Times New Roman"/>
+          <w:b/>
+          <w:sz w:val="28"/>
+          <w:szCs w:val="28"/>
+          <w:lang w:val="en-US" w:bidi="ar-SA"/>
+        </w:rPr>
+      </w:pPr>
+      <w:r>
+        <w:rPr>
+          <w:rFonts w:ascii="Times New Roman" w:eastAsia="Times New Roman" w:hAnsi="Times New Roman" w:cs="Times New Roman"/>
+          <w:b/>
+          <w:sz w:val="28"/>
+          <w:szCs w:val="28"/>
+          <w:lang w:val="en-US" w:bidi="ar-SA"/>
+        </w:rPr>
+        <w:t>B</w:t>
+      </w:r>
+      <w:r>
+        <w:rPr>
+          <w:rFonts w:ascii="Times New Roman" w:eastAsia="Times New Roman" w:hAnsi="Times New Roman" w:cs="Times New Roman"/>
+          <w:b/>
+          <w:sz w:val="28"/>
+          <w:szCs w:val="28"/>
+          <w:lang w:val="en-US" w:bidi="ar-SA"/>
+        </w:rPr>
+        <w:t>.</w:t>
+      </w:r>
+      <w:r>
+        <w:rPr>
+          <w:rFonts w:ascii="Times New Roman" w:eastAsia="Times New Roman" w:hAnsi="Times New Roman" w:cs="Times New Roman"/>
+          <w:b/>
+          <w:sz w:val="28"/>
+          <w:szCs w:val="28"/>
+          <w:lang w:val="en-US" w:bidi="ar-SA"/>
+        </w:rPr>
+        <w:t xml:space="preserve"> </w:t>
+      </w:r>
+      <w:r>
+        <w:rPr>
+          <w:rFonts w:ascii="Times New Roman" w:eastAsia="Times New Roman" w:hAnsi="Times New Roman" w:cs="Times New Roman"/>
           <w:b/>
           <w:sz w:val="28"/>
           <w:szCs w:val="28"/>
@@ -1679,7 +2015,47 @@
           <w:szCs w:val="28"/>
           <w:lang w:val="en-US" w:bidi="ar-SA"/>
         </w:rPr>
-        <w:t xml:space="preserve">                             (5×2=10)</w:t>
+        <w:t xml:space="preserve">                             (5×</w:t>
+      </w:r>
+      <w:r>
+        <w:rPr>
+          <w:rFonts w:ascii="Times New Roman" w:eastAsia="Times New Roman" w:hAnsi="Times New Roman" w:cs="Times New Roman"/>
+          <w:b/>
+          <w:sz w:val="28"/>
+          <w:szCs w:val="28"/>
+          <w:lang w:val="en-US" w:bidi="ar-SA"/>
+        </w:rPr>
+        <w:t>1</w:t>
+      </w:r>
+      <w:r>
+        <w:rPr>
+          <w:rFonts w:ascii="Times New Roman" w:eastAsia="Times New Roman" w:hAnsi="Times New Roman" w:cs="Times New Roman"/>
+          <w:b/>
+          <w:sz w:val="28"/>
+          <w:szCs w:val="28"/>
+          <w:lang w:val="en-US" w:bidi="ar-SA"/>
+        </w:rPr>
+        <w:t>=</w:t>
+      </w:r>
+      <w:r>
+        <w:rPr>
+          <w:rFonts w:ascii="Times New Roman" w:eastAsia="Times New Roman" w:hAnsi="Times New Roman" w:cs="Times New Roman"/>
+          <w:b/>
+          <w:sz w:val="28"/>
+          <w:szCs w:val="28"/>
+          <w:lang w:val="en-US" w:bidi="ar-SA"/>
+        </w:rPr>
+        <w:t>5</w:t>
+      </w:r>
+      <w:r>
+        <w:rPr>
+          <w:rFonts w:ascii="Times New Roman" w:eastAsia="Times New Roman" w:hAnsi="Times New Roman" w:cs="Times New Roman"/>
+          <w:b/>
+          <w:sz w:val="28"/>
+          <w:szCs w:val="28"/>
+          <w:lang w:val="en-US" w:bidi="ar-SA"/>
+        </w:rPr>
+        <w:t>)</w:t>
       </w:r>
     </w:p>
     <w:p>
@@ -1769,6 +2145,7 @@
     <w:p>
       <w:pPr>
         <w:spacing w:after="0" w:line="240" w:lineRule="auto"/>
+        <w:ind w:left="270" w:hanging="270"/>
         <w:jc w:val="both"/>
         <w:rPr>
           <w:rFonts w:ascii="Times New Roman" w:eastAsia="Times New Roman" w:hAnsi="Times New Roman" w:cs="Times New Roman"/>
@@ -1843,17 +2220,101 @@
           <w:lang w:val="en-US" w:bidi="ar-SA"/>
         </w:rPr>
       </w:pPr>
-      <w:proofErr w:type="spellStart"/>
-      <w:r>
-        <w:rPr>
-          <w:rFonts w:ascii="Times New Roman" w:eastAsia="Times New Roman" w:hAnsi="Times New Roman" w:cs="Times New Roman"/>
-          <w:sz w:val="28"/>
-          <w:szCs w:val="28"/>
-          <w:lang w:val="en-US" w:bidi="ar-SA"/>
-        </w:rPr>
-        <w:t>anuradha</w:t>
-      </w:r>
-      <w:proofErr w:type="spellEnd"/>
+      <w:r>
+        <w:rPr>
+          <w:rFonts w:ascii="Times New Roman" w:eastAsia="Times New Roman" w:hAnsi="Times New Roman" w:cs="Times New Roman"/>
+          <w:sz w:val="28"/>
+          <w:szCs w:val="28"/>
+          <w:lang w:val="en-US" w:bidi="ar-SA"/>
+        </w:rPr>
+        <w:t>anuradha koirala is A nepalese social activist and the founder of maiti nepal- a non-profit organization in nepal she works for victims of girls trafficking </w:t>
+      </w:r>
+    </w:p>
+    <w:p>
+      <w:pPr>
+        <w:spacing w:after="0" w:line="240" w:lineRule="auto"/>
+        <w:jc w:val="both"/>
+        <w:rPr>
+          <w:rFonts w:ascii="Times New Roman" w:eastAsia="Times New Roman" w:hAnsi="Times New Roman" w:cs="Times New Roman"/>
+          <w:sz w:val="28"/>
+          <w:szCs w:val="28"/>
+          <w:lang w:val="en-US" w:bidi="ar-SA"/>
+        </w:rPr>
+      </w:pPr>
+    </w:p>
+    <w:p>
+      <w:pPr>
+        <w:spacing w:after="0" w:line="240" w:lineRule="auto"/>
+        <w:jc w:val="both"/>
+        <w:rPr>
+          <w:rFonts w:ascii="Times New Roman" w:eastAsia="Times New Roman" w:hAnsi="Times New Roman" w:cs="Times New Roman"/>
+          <w:b/>
+          <w:sz w:val="28"/>
+          <w:szCs w:val="28"/>
+          <w:lang w:val="en-US" w:bidi="ar-SA"/>
+        </w:rPr>
+      </w:pPr>
+      <w:r>
+        <w:rPr>
+          <w:rFonts w:ascii="Times New Roman" w:eastAsia="Times New Roman" w:hAnsi="Times New Roman" w:cs="Times New Roman"/>
+          <w:b/>
+          <w:sz w:val="28"/>
+          <w:szCs w:val="28"/>
+          <w:lang w:val="en-US" w:bidi="ar-SA"/>
+        </w:rPr>
+        <w:t>6. Make sentence</w:t>
+      </w:r>
+      <w:r>
+        <w:rPr>
+          <w:rFonts w:ascii="Times New Roman" w:eastAsia="Times New Roman" w:hAnsi="Times New Roman" w:cs="Times New Roman"/>
+          <w:b/>
+          <w:sz w:val="28"/>
+          <w:szCs w:val="28"/>
+          <w:lang w:val="en-US" w:bidi="ar-SA"/>
+        </w:rPr>
+        <w:t>s</w:t>
+      </w:r>
+      <w:r>
+        <w:rPr>
+          <w:rFonts w:ascii="Times New Roman" w:eastAsia="Times New Roman" w:hAnsi="Times New Roman" w:cs="Times New Roman"/>
+          <w:b/>
+          <w:sz w:val="28"/>
+          <w:szCs w:val="28"/>
+          <w:lang w:val="en-US" w:bidi="ar-SA"/>
+        </w:rPr>
+        <w:t xml:space="preserve"> by using the following words.</w:t>
+      </w:r>
+      <w:r>
+        <w:rPr>
+          <w:rFonts w:ascii="Times New Roman" w:eastAsia="Times New Roman" w:hAnsi="Times New Roman" w:cs="Times New Roman"/>
+          <w:b/>
+          <w:sz w:val="28"/>
+          <w:szCs w:val="28"/>
+          <w:lang w:val="en-US" w:bidi="ar-SA"/>
+        </w:rPr>
+        <w:t xml:space="preserve">       (5×1=5)</w:t>
+      </w:r>
+    </w:p>
+    <w:p>
+      <w:pPr>
+        <w:spacing w:after="0" w:line="240" w:lineRule="auto"/>
+        <w:jc w:val="both"/>
+        <w:rPr>
+          <w:rFonts w:ascii="Times New Roman" w:eastAsia="Times New Roman" w:hAnsi="Times New Roman" w:cs="Times New Roman"/>
+          <w:sz w:val="28"/>
+          <w:szCs w:val="28"/>
+          <w:lang w:val="en-US" w:bidi="ar-SA"/>
+        </w:rPr>
+      </w:pPr>
+      <w:r>
+        <w:rPr>
+          <w:rFonts w:ascii="Times New Roman" w:eastAsia="Times New Roman" w:hAnsi="Times New Roman" w:cs="Times New Roman"/>
+          <w:sz w:val="28"/>
+          <w:szCs w:val="28"/>
+          <w:lang w:val="en-US" w:bidi="ar-SA"/>
+        </w:rPr>
+        <w:t>a.</w:t>
+      </w:r>
       <w:r>
         <w:rPr>
           <w:rFonts w:ascii="Times New Roman" w:eastAsia="Times New Roman" w:hAnsi="Times New Roman" w:cs="Times New Roman"/>
@@ -1863,57 +2324,36 @@
         </w:rPr>
         <w:t xml:space="preserve"> </w:t>
       </w:r>
-      <w:proofErr w:type="spellStart"/>
-      <w:r>
-        <w:rPr>
-          <w:rFonts w:ascii="Times New Roman" w:eastAsia="Times New Roman" w:hAnsi="Times New Roman" w:cs="Times New Roman"/>
-          <w:sz w:val="28"/>
-          <w:szCs w:val="28"/>
-          <w:lang w:val="en-US" w:bidi="ar-SA"/>
-        </w:rPr>
-        <w:t>koirala</w:t>
-      </w:r>
-      <w:proofErr w:type="spellEnd"/>
-      <w:r>
-        <w:rPr>
-          <w:rFonts w:ascii="Times New Roman" w:eastAsia="Times New Roman" w:hAnsi="Times New Roman" w:cs="Times New Roman"/>
-          <w:sz w:val="28"/>
-          <w:szCs w:val="28"/>
-          <w:lang w:val="en-US" w:bidi="ar-SA"/>
-        </w:rPr>
-        <w:t xml:space="preserve"> is A </w:t>
-      </w:r>
-      <w:proofErr w:type="spellStart"/>
-      <w:r>
-        <w:rPr>
-          <w:rFonts w:ascii="Times New Roman" w:eastAsia="Times New Roman" w:hAnsi="Times New Roman" w:cs="Times New Roman"/>
-          <w:sz w:val="28"/>
-          <w:szCs w:val="28"/>
-          <w:lang w:val="en-US" w:bidi="ar-SA"/>
-        </w:rPr>
-        <w:t>nepalese</w:t>
-      </w:r>
-      <w:proofErr w:type="spellEnd"/>
-      <w:r>
-        <w:rPr>
-          <w:rFonts w:ascii="Times New Roman" w:eastAsia="Times New Roman" w:hAnsi="Times New Roman" w:cs="Times New Roman"/>
-          <w:sz w:val="28"/>
-          <w:szCs w:val="28"/>
-          <w:lang w:val="en-US" w:bidi="ar-SA"/>
-        </w:rPr>
-        <w:t xml:space="preserve"> social activist and the founder of </w:t>
-      </w:r>
-      <w:proofErr w:type="spellStart"/>
-      <w:r>
-        <w:rPr>
-          <w:rFonts w:ascii="Times New Roman" w:eastAsia="Times New Roman" w:hAnsi="Times New Roman" w:cs="Times New Roman"/>
-          <w:sz w:val="28"/>
-          <w:szCs w:val="28"/>
-          <w:lang w:val="en-US" w:bidi="ar-SA"/>
-        </w:rPr>
-        <w:t>maiti</w:t>
-      </w:r>
-      <w:proofErr w:type="spellEnd"/>
+      <w:r>
+        <w:rPr>
+          <w:rFonts w:ascii="Times New Roman" w:eastAsia="Times New Roman" w:hAnsi="Times New Roman" w:cs="Times New Roman"/>
+          <w:sz w:val="28"/>
+          <w:szCs w:val="28"/>
+          <w:lang w:val="en-US" w:bidi="ar-SA"/>
+        </w:rPr>
+        <w:t>punishment</w:t>
+      </w:r>
+    </w:p>
+    <w:p>
+      <w:pPr>
+        <w:spacing w:after="0" w:line="240" w:lineRule="auto"/>
+        <w:jc w:val="both"/>
+        <w:rPr>
+          <w:rFonts w:ascii="Times New Roman" w:eastAsia="Times New Roman" w:hAnsi="Times New Roman" w:cs="Times New Roman"/>
+          <w:sz w:val="28"/>
+          <w:szCs w:val="28"/>
+          <w:lang w:val="en-US" w:bidi="ar-SA"/>
+        </w:rPr>
+      </w:pPr>
+      <w:r>
+        <w:rPr>
+          <w:rFonts w:ascii="Times New Roman" w:eastAsia="Times New Roman" w:hAnsi="Times New Roman" w:cs="Times New Roman"/>
+          <w:sz w:val="28"/>
+          <w:szCs w:val="28"/>
+          <w:lang w:val="en-US" w:bidi="ar-SA"/>
+        </w:rPr>
+        <w:t>b.</w:t>
+      </w:r>
       <w:r>
         <w:rPr>
           <w:rFonts w:ascii="Times New Roman" w:eastAsia="Times New Roman" w:hAnsi="Times New Roman" w:cs="Times New Roman"/>
@@ -1923,115 +2363,117 @@
         </w:rPr>
         <w:t xml:space="preserve"> </w:t>
       </w:r>
-      <w:proofErr w:type="spellStart"/>
-      <w:r>
-        <w:rPr>
-          <w:rFonts w:ascii="Times New Roman" w:eastAsia="Times New Roman" w:hAnsi="Times New Roman" w:cs="Times New Roman"/>
-          <w:sz w:val="28"/>
-          <w:szCs w:val="28"/>
-          <w:lang w:val="en-US" w:bidi="ar-SA"/>
-        </w:rPr>
-        <w:t>nepal</w:t>
-      </w:r>
-      <w:proofErr w:type="spellEnd"/>
-      <w:r>
-        <w:rPr>
-          <w:rFonts w:ascii="Times New Roman" w:eastAsia="Times New Roman" w:hAnsi="Times New Roman" w:cs="Times New Roman"/>
-          <w:sz w:val="28"/>
-          <w:szCs w:val="28"/>
-          <w:lang w:val="en-US" w:bidi="ar-SA"/>
-        </w:rPr>
-        <w:t xml:space="preserve">- a non-profit organization in </w:t>
-      </w:r>
-      <w:proofErr w:type="spellStart"/>
-      <w:r>
-        <w:rPr>
-          <w:rFonts w:ascii="Times New Roman" w:eastAsia="Times New Roman" w:hAnsi="Times New Roman" w:cs="Times New Roman"/>
-          <w:sz w:val="28"/>
-          <w:szCs w:val="28"/>
-          <w:lang w:val="en-US" w:bidi="ar-SA"/>
-        </w:rPr>
-        <w:t>nepal</w:t>
-      </w:r>
-      <w:proofErr w:type="spellEnd"/>
-      <w:r>
-        <w:rPr>
-          <w:rFonts w:ascii="Times New Roman" w:eastAsia="Times New Roman" w:hAnsi="Times New Roman" w:cs="Times New Roman"/>
-          <w:sz w:val="28"/>
-          <w:szCs w:val="28"/>
-          <w:lang w:val="en-US" w:bidi="ar-SA"/>
-        </w:rPr>
-        <w:t xml:space="preserve"> she works for victims of girls trafficking </w:t>
-      </w:r>
-    </w:p>
-    <w:p>
-      <w:pPr>
-        <w:spacing w:after="0" w:line="240" w:lineRule="auto"/>
-        <w:jc w:val="both"/>
-        <w:rPr>
-          <w:rFonts w:ascii="Times New Roman" w:eastAsia="Times New Roman" w:hAnsi="Times New Roman" w:cs="Times New Roman"/>
-          <w:sz w:val="28"/>
-          <w:szCs w:val="28"/>
-          <w:lang w:val="en-US" w:bidi="ar-SA"/>
-        </w:rPr>
-      </w:pPr>
-    </w:p>
-    <w:p>
-      <w:pPr>
-        <w:spacing w:after="0" w:line="240" w:lineRule="auto"/>
-        <w:jc w:val="both"/>
-        <w:rPr>
-          <w:rFonts w:ascii="Times New Roman" w:eastAsia="Times New Roman" w:hAnsi="Times New Roman" w:cs="Times New Roman"/>
-          <w:b/>
-          <w:sz w:val="28"/>
-          <w:szCs w:val="28"/>
-          <w:lang w:val="en-US" w:bidi="ar-SA"/>
-        </w:rPr>
-      </w:pPr>
-      <w:r>
-        <w:rPr>
-          <w:rFonts w:ascii="Times New Roman" w:eastAsia="Times New Roman" w:hAnsi="Times New Roman" w:cs="Times New Roman"/>
-          <w:b/>
-          <w:sz w:val="28"/>
-          <w:szCs w:val="28"/>
-          <w:lang w:val="en-US" w:bidi="ar-SA"/>
-        </w:rPr>
-        <w:t>6. Make a sentence by using the following words.</w:t>
-      </w:r>
-      <w:r>
-        <w:rPr>
-          <w:rFonts w:ascii="Times New Roman" w:eastAsia="Times New Roman" w:hAnsi="Times New Roman" w:cs="Times New Roman"/>
-          <w:b/>
-          <w:sz w:val="28"/>
-          <w:szCs w:val="28"/>
-          <w:lang w:val="en-US" w:bidi="ar-SA"/>
-        </w:rPr>
-        <w:t xml:space="preserve">       (5×1=5)</w:t>
-      </w:r>
-    </w:p>
-    <w:p>
-      <w:pPr>
-        <w:spacing w:after="0" w:line="240" w:lineRule="auto"/>
-        <w:jc w:val="both"/>
-        <w:rPr>
-          <w:rFonts w:ascii="Times New Roman" w:eastAsia="Times New Roman" w:hAnsi="Times New Roman" w:cs="Times New Roman"/>
-          <w:sz w:val="28"/>
-          <w:szCs w:val="28"/>
-          <w:lang w:val="en-US" w:bidi="ar-SA"/>
-        </w:rPr>
-      </w:pPr>
-      <w:r>
-        <w:rPr>
-          <w:rFonts w:ascii="Times New Roman" w:eastAsia="Times New Roman" w:hAnsi="Times New Roman" w:cs="Times New Roman"/>
-          <w:sz w:val="28"/>
-          <w:szCs w:val="28"/>
-          <w:lang w:val="en-US" w:bidi="ar-SA"/>
-        </w:rPr>
-        <w:t>a.</w:t>
-      </w:r>
-      <w:r>
-        <w:rPr>
-          <w:rFonts w:ascii="Times New Roman" w:eastAsia="Times New Roman" w:hAnsi="Times New Roman" w:cs="Times New Roman"/>
+      <w:r>
+        <w:rPr>
+          <w:rFonts w:ascii="Times New Roman" w:eastAsia="Times New Roman" w:hAnsi="Times New Roman" w:cs="Times New Roman"/>
+          <w:sz w:val="28"/>
+          <w:szCs w:val="28"/>
+          <w:lang w:val="en-US" w:bidi="ar-SA"/>
+        </w:rPr>
+        <w:t>direction </w:t>
+      </w:r>
+    </w:p>
+    <w:p>
+      <w:pPr>
+        <w:spacing w:after="0" w:line="240" w:lineRule="auto"/>
+        <w:jc w:val="both"/>
+        <w:rPr>
+          <w:rFonts w:ascii="Times New Roman" w:eastAsia="Times New Roman" w:hAnsi="Times New Roman" w:cs="Times New Roman"/>
+          <w:sz w:val="28"/>
+          <w:szCs w:val="28"/>
+          <w:lang w:val="en-US" w:bidi="ar-SA"/>
+        </w:rPr>
+      </w:pPr>
+      <w:r>
+        <w:rPr>
+          <w:rFonts w:ascii="Times New Roman" w:eastAsia="Times New Roman" w:hAnsi="Times New Roman" w:cs="Times New Roman"/>
+          <w:sz w:val="28"/>
+          <w:szCs w:val="28"/>
+          <w:lang w:val="en-US" w:bidi="ar-SA"/>
+        </w:rPr>
+        <w:t>c. teacher </w:t>
+      </w:r>
+    </w:p>
+    <w:p>
+      <w:pPr>
+        <w:spacing w:after="0" w:line="240" w:lineRule="auto"/>
+        <w:jc w:val="both"/>
+        <w:rPr>
+          <w:rFonts w:ascii="Times New Roman" w:eastAsia="Times New Roman" w:hAnsi="Times New Roman" w:cs="Times New Roman"/>
+          <w:sz w:val="28"/>
+          <w:szCs w:val="28"/>
+          <w:lang w:val="en-US" w:bidi="ar-SA"/>
+        </w:rPr>
+      </w:pPr>
+      <w:r>
+        <w:rPr>
+          <w:rFonts w:ascii="Times New Roman" w:eastAsia="Times New Roman" w:hAnsi="Times New Roman" w:cs="Times New Roman"/>
+          <w:sz w:val="28"/>
+          <w:szCs w:val="28"/>
+          <w:lang w:val="en-US" w:bidi="ar-SA"/>
+        </w:rPr>
+        <w:t>d. worker </w:t>
+      </w:r>
+    </w:p>
+    <w:p>
+      <w:pPr>
+        <w:spacing w:after="0" w:line="240" w:lineRule="auto"/>
+        <w:jc w:val="both"/>
+        <w:rPr>
+          <w:rFonts w:ascii="Times New Roman" w:eastAsia="Times New Roman" w:hAnsi="Times New Roman" w:cs="Times New Roman"/>
+          <w:sz w:val="28"/>
+          <w:szCs w:val="28"/>
+          <w:lang w:val="en-US" w:bidi="ar-SA"/>
+        </w:rPr>
+      </w:pPr>
+      <w:r>
+        <w:rPr>
+          <w:rFonts w:ascii="Times New Roman" w:eastAsia="Times New Roman" w:hAnsi="Times New Roman" w:cs="Times New Roman"/>
+          <w:sz w:val="28"/>
+          <w:szCs w:val="28"/>
+          <w:lang w:val="en-US" w:bidi="ar-SA"/>
+        </w:rPr>
+        <w:t>e. education </w:t>
+      </w:r>
+    </w:p>
+    <w:p>
+      <w:pPr>
+        <w:spacing w:after="0" w:line="240" w:lineRule="auto"/>
+        <w:jc w:val="both"/>
+        <w:rPr>
+          <w:rFonts w:ascii="Times New Roman" w:eastAsia="Times New Roman" w:hAnsi="Times New Roman" w:cs="Times New Roman"/>
+          <w:sz w:val="28"/>
+          <w:szCs w:val="28"/>
+          <w:lang w:val="en-US" w:bidi="ar-SA"/>
+        </w:rPr>
+      </w:pPr>
+    </w:p>
+    <w:p>
+      <w:pPr>
+        <w:spacing w:after="0" w:line="240" w:lineRule="auto"/>
+        <w:jc w:val="both"/>
+        <w:rPr>
+          <w:rFonts w:ascii="Times New Roman" w:eastAsia="Times New Roman" w:hAnsi="Times New Roman" w:cs="Times New Roman"/>
+          <w:b/>
+          <w:sz w:val="28"/>
+          <w:szCs w:val="28"/>
+          <w:lang w:val="en-US" w:bidi="ar-SA"/>
+        </w:rPr>
+      </w:pPr>
+      <w:r>
+        <w:rPr>
+          <w:rFonts w:ascii="Times New Roman" w:eastAsia="Times New Roman" w:hAnsi="Times New Roman" w:cs="Times New Roman"/>
+          <w:b/>
+          <w:sz w:val="28"/>
+          <w:szCs w:val="28"/>
+          <w:lang w:val="en-US" w:bidi="ar-SA"/>
+        </w:rPr>
+        <w:t>7.</w:t>
+      </w:r>
+      <w:r>
+        <w:rPr>
+          <w:rFonts w:ascii="Times New Roman" w:eastAsia="Times New Roman" w:hAnsi="Times New Roman" w:cs="Times New Roman"/>
+          <w:b/>
           <w:sz w:val="28"/>
           <w:szCs w:val="28"/>
           <w:lang w:val="en-US" w:bidi="ar-SA"/>
@@ -2041,162 +2483,6 @@
       <w:r>
         <w:rPr>
           <w:rFonts w:ascii="Times New Roman" w:eastAsia="Times New Roman" w:hAnsi="Times New Roman" w:cs="Times New Roman"/>
-          <w:sz w:val="28"/>
-          <w:szCs w:val="28"/>
-          <w:lang w:val="en-US" w:bidi="ar-SA"/>
-        </w:rPr>
-        <w:t>punishment</w:t>
-      </w:r>
-    </w:p>
-    <w:p>
-      <w:pPr>
-        <w:spacing w:after="0" w:line="240" w:lineRule="auto"/>
-        <w:jc w:val="both"/>
-        <w:rPr>
-          <w:rFonts w:ascii="Times New Roman" w:eastAsia="Times New Roman" w:hAnsi="Times New Roman" w:cs="Times New Roman"/>
-          <w:sz w:val="28"/>
-          <w:szCs w:val="28"/>
-          <w:lang w:val="en-US" w:bidi="ar-SA"/>
-        </w:rPr>
-      </w:pPr>
-      <w:r>
-        <w:rPr>
-          <w:rFonts w:ascii="Times New Roman" w:eastAsia="Times New Roman" w:hAnsi="Times New Roman" w:cs="Times New Roman"/>
-          <w:sz w:val="28"/>
-          <w:szCs w:val="28"/>
-          <w:lang w:val="en-US" w:bidi="ar-SA"/>
-        </w:rPr>
-        <w:t>b.</w:t>
-      </w:r>
-      <w:r>
-        <w:rPr>
-          <w:rFonts w:ascii="Times New Roman" w:eastAsia="Times New Roman" w:hAnsi="Times New Roman" w:cs="Times New Roman"/>
-          <w:sz w:val="28"/>
-          <w:szCs w:val="28"/>
-          <w:lang w:val="en-US" w:bidi="ar-SA"/>
-        </w:rPr>
-        <w:t xml:space="preserve"> </w:t>
-      </w:r>
-      <w:r>
-        <w:rPr>
-          <w:rFonts w:ascii="Times New Roman" w:eastAsia="Times New Roman" w:hAnsi="Times New Roman" w:cs="Times New Roman"/>
-          <w:sz w:val="28"/>
-          <w:szCs w:val="28"/>
-          <w:lang w:val="en-US" w:bidi="ar-SA"/>
-        </w:rPr>
-        <w:t>direction </w:t>
-      </w:r>
-    </w:p>
-    <w:p>
-      <w:pPr>
-        <w:spacing w:after="0" w:line="240" w:lineRule="auto"/>
-        <w:jc w:val="both"/>
-        <w:rPr>
-          <w:rFonts w:ascii="Times New Roman" w:eastAsia="Times New Roman" w:hAnsi="Times New Roman" w:cs="Times New Roman"/>
-          <w:sz w:val="28"/>
-          <w:szCs w:val="28"/>
-          <w:lang w:val="en-US" w:bidi="ar-SA"/>
-        </w:rPr>
-      </w:pPr>
-      <w:r>
-        <w:rPr>
-          <w:rFonts w:ascii="Times New Roman" w:eastAsia="Times New Roman" w:hAnsi="Times New Roman" w:cs="Times New Roman"/>
-          <w:sz w:val="28"/>
-          <w:szCs w:val="28"/>
-          <w:lang w:val="en-US" w:bidi="ar-SA"/>
-        </w:rPr>
-        <w:t>c. teacher </w:t>
-      </w:r>
-    </w:p>
-    <w:p>
-      <w:pPr>
-        <w:spacing w:after="0" w:line="240" w:lineRule="auto"/>
-        <w:jc w:val="both"/>
-        <w:rPr>
-          <w:rFonts w:ascii="Times New Roman" w:eastAsia="Times New Roman" w:hAnsi="Times New Roman" w:cs="Times New Roman"/>
-          <w:sz w:val="28"/>
-          <w:szCs w:val="28"/>
-          <w:lang w:val="en-US" w:bidi="ar-SA"/>
-        </w:rPr>
-      </w:pPr>
-      <w:r>
-        <w:rPr>
-          <w:rFonts w:ascii="Times New Roman" w:eastAsia="Times New Roman" w:hAnsi="Times New Roman" w:cs="Times New Roman"/>
-          <w:sz w:val="28"/>
-          <w:szCs w:val="28"/>
-          <w:lang w:val="en-US" w:bidi="ar-SA"/>
-        </w:rPr>
-        <w:t>d. worker </w:t>
-      </w:r>
-    </w:p>
-    <w:p>
-      <w:pPr>
-        <w:spacing w:after="0" w:line="240" w:lineRule="auto"/>
-        <w:jc w:val="both"/>
-        <w:rPr>
-          <w:rFonts w:ascii="Times New Roman" w:eastAsia="Times New Roman" w:hAnsi="Times New Roman" w:cs="Times New Roman"/>
-          <w:sz w:val="28"/>
-          <w:szCs w:val="28"/>
-          <w:lang w:val="en-US" w:bidi="ar-SA"/>
-        </w:rPr>
-      </w:pPr>
-      <w:r>
-        <w:rPr>
-          <w:rFonts w:ascii="Times New Roman" w:eastAsia="Times New Roman" w:hAnsi="Times New Roman" w:cs="Times New Roman"/>
-          <w:sz w:val="28"/>
-          <w:szCs w:val="28"/>
-          <w:lang w:val="en-US" w:bidi="ar-SA"/>
-        </w:rPr>
-        <w:t>e. education </w:t>
-      </w:r>
-    </w:p>
-    <w:p>
-      <w:pPr>
-        <w:spacing w:after="0" w:line="240" w:lineRule="auto"/>
-        <w:jc w:val="both"/>
-        <w:rPr>
-          <w:rFonts w:ascii="Times New Roman" w:eastAsia="Times New Roman" w:hAnsi="Times New Roman" w:cs="Times New Roman"/>
-          <w:sz w:val="28"/>
-          <w:szCs w:val="28"/>
-          <w:lang w:val="en-US" w:bidi="ar-SA"/>
-        </w:rPr>
-      </w:pPr>
-    </w:p>
-    <w:p>
-      <w:pPr>
-        <w:spacing w:after="0" w:line="240" w:lineRule="auto"/>
-        <w:jc w:val="both"/>
-        <w:rPr>
-          <w:rFonts w:ascii="Times New Roman" w:eastAsia="Times New Roman" w:hAnsi="Times New Roman" w:cs="Times New Roman"/>
-          <w:b/>
-          <w:sz w:val="28"/>
-          <w:szCs w:val="28"/>
-          <w:lang w:val="en-US" w:bidi="ar-SA"/>
-        </w:rPr>
-      </w:pPr>
-      <w:r>
-        <w:rPr>
-          <w:rFonts w:ascii="Times New Roman" w:eastAsia="Times New Roman" w:hAnsi="Times New Roman" w:cs="Times New Roman"/>
-          <w:b/>
-          <w:sz w:val="28"/>
-          <w:szCs w:val="28"/>
-          <w:lang w:val="en-US" w:bidi="ar-SA"/>
-        </w:rPr>
-        <w:t>7.</w:t>
-      </w:r>
-      <w:r>
-        <w:rPr>
-          <w:rFonts w:ascii="Times New Roman" w:eastAsia="Times New Roman" w:hAnsi="Times New Roman" w:cs="Times New Roman"/>
-          <w:b/>
-          <w:sz w:val="28"/>
-          <w:szCs w:val="28"/>
-          <w:lang w:val="en-US" w:bidi="ar-SA"/>
-        </w:rPr>
-        <w:t xml:space="preserve"> </w:t>
-      </w:r>
-      <w:r>
-        <w:rPr>
-          <w:rFonts w:ascii="Times New Roman" w:eastAsia="Times New Roman" w:hAnsi="Times New Roman" w:cs="Times New Roman"/>
           <w:b/>
           <w:sz w:val="28"/>
           <w:szCs w:val="28"/>
@@ -2222,20 +2508,8 @@
           <w:szCs w:val="28"/>
           <w:lang w:val="en-US" w:bidi="ar-SA"/>
         </w:rPr>
-        <w:t xml:space="preserve">s about how to make an </w:t>
-      </w:r>
-      <w:proofErr w:type="spellStart"/>
-      <w:r>
-        <w:rPr>
-          <w:rFonts w:ascii="Times New Roman" w:eastAsia="Times New Roman" w:hAnsi="Times New Roman" w:cs="Times New Roman"/>
-          <w:b/>
-          <w:sz w:val="28"/>
-          <w:szCs w:val="28"/>
-          <w:lang w:val="en-US" w:bidi="ar-SA"/>
-        </w:rPr>
-        <w:t>omlette</w:t>
-      </w:r>
-      <w:proofErr w:type="spellEnd"/>
+        <w:t>s about how to make an omlette</w:t>
+      </w:r>
       <w:r>
         <w:rPr>
           <w:rFonts w:ascii="Times New Roman" w:eastAsia="Times New Roman" w:hAnsi="Times New Roman" w:cs="Times New Roman"/>
@@ -3096,7 +3370,6 @@
   <w:style w:type="character" w:default="1" w:styleId="DefaultParagraphFont">
     <w:name w:val="Default Paragraph Font"/>
     <w:uiPriority w:val="1"/>
-    <w:semiHidden/>
     <w:unhideWhenUsed/>
   </w:style>
   <w:style w:type="table" w:default="1" w:styleId="TableNormal">

</xml_diff>